<commit_message>
Rulebook: update overview sentence (regime filter in, volume out)
Co-Authored-By: Claude Opus 4.8 <noreply@anthropic.com>
</commit_message>
<xml_diff>
--- a/Mean_Reversion_Rulebook_1.docx
+++ b/Mean_Reversion_Rulebook_1.docx
@@ -157,16 +157,10 @@
       <w:pPr>
         <w:spacing w:before="80" w:after="80"/>
       </w:pPr>
-      <w:r>
-        <w:t xml:space="preserve">This rulebook defines a systematic mean reversion swing trading strategy based on Larry Connors' </w:t>
-      </w:r>
       <w:proofErr w:type="gramStart"/>
-      <w:r>
-        <w:t>RSI(</w:t>
-      </w:r>
       <w:proofErr w:type="gramEnd"/>
       <w:r>
-        <w:t>2) methodology, enhanced with multi-timeframe analysis, volume confirmation, and disciplined risk management.</w:t>
+        <w:t>This rulebook defines a systematic mean reversion swing trading strategy based on Larry Connors' RSI(2) methodology, enhanced with multi-timeframe analysis, a weekly ADX regime filter, and disciplined risk management. (Volume is computed and logged but no longer used as an entry filter — see Section 11.)</w:t>
       </w:r>
     </w:p>
     <w:p>

</xml_diff>

<commit_message>
Disable trend SMA gate; sync rulebook to v1.2
Add USE_TREND_FILTER (default False): turns off the weekly SMA50/200 +
daily SMA50 entry gate and the weekly-SMA200 structural exit, so the
sideways universe can actually trade. With this and the regime filter
already off, entries are pure RSI(2) mean reversion.

Update the rulebook to v1.2 to match the live code (universe = 30
screener picks, trend + regime gates disabled) and snapshot v1.1.

Co-Authored-By: Claude Opus 4.8 <noreply@anthropic.com>
</commit_message>
<xml_diff>
--- a/Mean_Reversion_Rulebook_1.docx
+++ b/Mean_Reversion_Rulebook_1.docx
@@ -92,7 +92,7 @@
           <w:sz w:val="24"/>
           <w:szCs w:val="24"/>
         </w:rPr>
-        <w:t xml:space="preserve">Long </w:t>
+        <w:t>Long Only  |  Sideways Screener Universe  |  Paper Trading</w:t>
       </w:r>
       <w:proofErr w:type="gramStart"/>
       <w:r>
@@ -101,7 +101,6 @@
           <w:sz w:val="24"/>
           <w:szCs w:val="24"/>
         </w:rPr>
-        <w:t>Only  |</w:t>
       </w:r>
       <w:proofErr w:type="gramEnd"/>
       <w:r>
@@ -110,7 +109,6 @@
           <w:sz w:val="24"/>
           <w:szCs w:val="24"/>
         </w:rPr>
-        <w:t xml:space="preserve">  ETF </w:t>
       </w:r>
       <w:proofErr w:type="gramStart"/>
       <w:r>
@@ -119,7 +117,6 @@
           <w:sz w:val="24"/>
           <w:szCs w:val="24"/>
         </w:rPr>
-        <w:t>Universe  |</w:t>
       </w:r>
       <w:proofErr w:type="gramEnd"/>
       <w:r>
@@ -128,7 +125,6 @@
           <w:sz w:val="24"/>
           <w:szCs w:val="24"/>
         </w:rPr>
-        <w:t xml:space="preserve">  Paper Trading</w:t>
       </w:r>
     </w:p>
     <w:p>
@@ -139,7 +135,7 @@
       <w:proofErr w:type="gramStart"/>
       <w:proofErr w:type="gramEnd"/>
       <w:r>
-        <w:t>Version 1.1  |  Updated May 30, 2026</w:t>
+        <w:t>Version 1.2  |  Updated June 15, 2026</w:t>
       </w:r>
     </w:p>
     <w:p>
@@ -160,7 +156,7 @@
       <w:proofErr w:type="gramStart"/>
       <w:proofErr w:type="gramEnd"/>
       <w:r>
-        <w:t>This rulebook defines a systematic mean reversion swing trading strategy based on Larry Connors' RSI(2) methodology, enhanced with multi-timeframe analysis, a weekly ADX regime filter, and disciplined risk management. (Volume is computed and logged but no longer used as an entry filter — see Section 11.)</w:t>
+        <w:t>This rulebook defines a systematic mean reversion swing trading strategy based on Larry Connors' RSI(2) methodology with disciplined risk management. As of v1.2 the universe is the top 30 range-bound (“sideways”) names selected by screener.py, and the trend overlays — the weekly SMA(50)/SMA(200) gate, the daily SMA(50) gate, and the weekly ADX regime band — are DISABLED so the strategy trades pure mean reversion regardless of trend. Volume is also computed and logged but not used as an entry filter (see Section 11).</w:t>
       </w:r>
     </w:p>
     <w:p>
@@ -516,7 +512,7 @@
           </w:tcPr>
           <w:p>
             <w:r>
-              <w:t>Weekly SMA(50) + SMA(200), then weekly ADX(14) regime band [20, 25)</w:t>
+              <w:t>DISABLED (v1.2) — no weekly/daily SMA or ADX gate; pure mean reversion</w:t>
             </w:r>
           </w:p>
         </w:tc>
@@ -644,7 +640,7 @@
                 <w:sz w:val="20"/>
                 <w:szCs w:val="20"/>
               </w:rPr>
-              <w:t>16 ETFs (Broad Market + Sector)</w:t>
+              <w:t>Top 30 sideways names selected by screener.py (v1.2)</w:t>
             </w:r>
           </w:p>
         </w:tc>
@@ -876,7 +872,7 @@
           </w:tcPr>
           <w:p>
             <w:r>
-              <w:t>Weekly ADX(14) in [20, 25) — moderate trend (v1.1)</w:t>
+              <w:t>DISABLED (v1.2) — was weekly ADX(14) in [20, 25)</w:t>
             </w:r>
           </w:p>
         </w:tc>
@@ -903,7 +899,7 @@
         <w:pStyle w:val="Heading2"/>
       </w:pPr>
       <w:r>
-        <w:t>2A. Broad Market ETFs</w:t>
+        <w:t>2A. Current Universe — Top 30 Sideways Picks</w:t>
       </w:r>
     </w:p>
     <w:tbl>
@@ -1024,7 +1020,7 @@
                 <w:sz w:val="20"/>
                 <w:szCs w:val="20"/>
               </w:rPr>
-              <w:t>Index Tracked</w:t>
+              <w:t>Type</w:t>
             </w:r>
           </w:p>
         </w:tc>
@@ -1060,7 +1056,7 @@
                 <w:sz w:val="20"/>
                 <w:szCs w:val="20"/>
               </w:rPr>
-              <w:t>SPY</w:t>
+              <w:t>XLE</w:t>
             </w:r>
           </w:p>
         </w:tc>
@@ -1088,7 +1084,7 @@
                 <w:sz w:val="20"/>
                 <w:szCs w:val="20"/>
               </w:rPr>
-              <w:t>SPDR S&amp;P 500 ETF</w:t>
+              <w:t>Energy Select Sector SPDR</w:t>
             </w:r>
           </w:p>
         </w:tc>
@@ -1116,7 +1112,7 @@
                 <w:sz w:val="20"/>
                 <w:szCs w:val="20"/>
               </w:rPr>
-              <w:t>S&amp;P 500</w:t>
+              <w:t>Sector ETF</w:t>
             </w:r>
           </w:p>
         </w:tc>
@@ -1152,7 +1148,7 @@
                 <w:sz w:val="20"/>
                 <w:szCs w:val="20"/>
               </w:rPr>
-              <w:t>QQQ</w:t>
+              <w:t>XLI</w:t>
             </w:r>
           </w:p>
         </w:tc>
@@ -1180,7 +1176,7 @@
                 <w:sz w:val="20"/>
                 <w:szCs w:val="20"/>
               </w:rPr>
-              <w:t>Invesco Nasdaq 100 ETF</w:t>
+              <w:t>Industrial Select Sector SPDR</w:t>
             </w:r>
           </w:p>
         </w:tc>
@@ -1208,7 +1204,7 @@
                 <w:sz w:val="20"/>
                 <w:szCs w:val="20"/>
               </w:rPr>
-              <w:t>Nasdaq 100</w:t>
+              <w:t>Sector ETF</w:t>
             </w:r>
           </w:p>
         </w:tc>
@@ -1244,7 +1240,7 @@
                 <w:sz w:val="20"/>
                 <w:szCs w:val="20"/>
               </w:rPr>
-              <w:t>IWM</w:t>
+              <w:t>XBI</w:t>
             </w:r>
           </w:p>
         </w:tc>
@@ -1272,7 +1268,7 @@
                 <w:sz w:val="20"/>
                 <w:szCs w:val="20"/>
               </w:rPr>
-              <w:t>iShares Russell 2000 ETF</w:t>
+              <w:t>SPDR S&amp;P Biotech ETF</w:t>
             </w:r>
           </w:p>
         </w:tc>
@@ -1300,7 +1296,7 @@
                 <w:sz w:val="20"/>
                 <w:szCs w:val="20"/>
               </w:rPr>
-              <w:t>Russell 2000 (Small Cap)</w:t>
+              <w:t>Sector ETF</w:t>
             </w:r>
           </w:p>
         </w:tc>
@@ -1336,7 +1332,7 @@
                 <w:sz w:val="20"/>
                 <w:szCs w:val="20"/>
               </w:rPr>
-              <w:t>DIA</w:t>
+              <w:t>SPGI</w:t>
             </w:r>
           </w:p>
         </w:tc>
@@ -1364,7 +1360,7 @@
                 <w:sz w:val="20"/>
                 <w:szCs w:val="20"/>
               </w:rPr>
-              <w:t>SPDR Dow Jones ETF</w:t>
+              <w:t>S&amp;P Global Inc.</w:t>
             </w:r>
           </w:p>
         </w:tc>
@@ -1392,7 +1388,7 @@
                 <w:sz w:val="20"/>
                 <w:szCs w:val="20"/>
               </w:rPr>
-              <w:t>Dow Jones Industrial Average</w:t>
+              <w:t>Stock</w:t>
             </w:r>
           </w:p>
         </w:tc>
@@ -1428,7 +1424,7 @@
                 <w:sz w:val="20"/>
                 <w:szCs w:val="20"/>
               </w:rPr>
-              <w:t>MDY</w:t>
+              <w:t>EOG</w:t>
             </w:r>
           </w:p>
         </w:tc>
@@ -1456,7 +1452,7 @@
                 <w:sz w:val="20"/>
                 <w:szCs w:val="20"/>
               </w:rPr>
-              <w:t xml:space="preserve">SPDR S&amp;P </w:t>
+              <w:t>EOG Resources Inc.</w:t>
             </w:r>
             <w:proofErr w:type="spellStart"/>
             <w:r>
@@ -1465,7 +1461,6 @@
                 <w:sz w:val="20"/>
                 <w:szCs w:val="20"/>
               </w:rPr>
-              <w:t>MidCap</w:t>
             </w:r>
             <w:proofErr w:type="spellEnd"/>
             <w:r>
@@ -1474,7 +1469,6 @@
                 <w:sz w:val="20"/>
                 <w:szCs w:val="20"/>
               </w:rPr>
-              <w:t xml:space="preserve"> 400 ETF</w:t>
             </w:r>
           </w:p>
         </w:tc>
@@ -1502,7 +1496,7 @@
                 <w:sz w:val="20"/>
                 <w:szCs w:val="20"/>
               </w:rPr>
-              <w:t xml:space="preserve">S&amp;P </w:t>
+              <w:t>Stock</w:t>
             </w:r>
             <w:proofErr w:type="spellStart"/>
             <w:r>
@@ -1511,7 +1505,6 @@
                 <w:sz w:val="20"/>
                 <w:szCs w:val="20"/>
               </w:rPr>
-              <w:t>MidCap</w:t>
             </w:r>
             <w:proofErr w:type="spellEnd"/>
             <w:r>
@@ -1520,7 +1513,806 @@
                 <w:sz w:val="20"/>
                 <w:szCs w:val="20"/>
               </w:rPr>
-              <w:t xml:space="preserve"> 400</w:t>
+            </w:r>
+          </w:p>
+        </w:tc>
+      </w:tr>
+      <w:tr>
+        <w:tc>
+          <w:tcPr>
+            <w:tcW w:type="dxa" w:w="1560"/>
+          </w:tcPr>
+          <w:p>
+            <w:r>
+              <w:t>XOM</w:t>
+            </w:r>
+          </w:p>
+        </w:tc>
+        <w:tc>
+          <w:tcPr>
+            <w:tcW w:type="dxa" w:w="3600"/>
+          </w:tcPr>
+          <w:p>
+            <w:r>
+              <w:t>Exxon Mobil Corp.</w:t>
+            </w:r>
+          </w:p>
+        </w:tc>
+        <w:tc>
+          <w:tcPr>
+            <w:tcW w:type="dxa" w:w="4200"/>
+          </w:tcPr>
+          <w:p>
+            <w:r>
+              <w:t>Stock</w:t>
+            </w:r>
+          </w:p>
+        </w:tc>
+      </w:tr>
+      <w:tr>
+        <w:tc>
+          <w:tcPr>
+            <w:tcW w:type="dxa" w:w="1560"/>
+          </w:tcPr>
+          <w:p>
+            <w:r>
+              <w:t>CVX</w:t>
+            </w:r>
+          </w:p>
+        </w:tc>
+        <w:tc>
+          <w:tcPr>
+            <w:tcW w:type="dxa" w:w="3600"/>
+          </w:tcPr>
+          <w:p>
+            <w:r>
+              <w:t>Chevron Corp.</w:t>
+            </w:r>
+          </w:p>
+        </w:tc>
+        <w:tc>
+          <w:tcPr>
+            <w:tcW w:type="dxa" w:w="4200"/>
+          </w:tcPr>
+          <w:p>
+            <w:r>
+              <w:t>Stock</w:t>
+            </w:r>
+          </w:p>
+        </w:tc>
+      </w:tr>
+      <w:tr>
+        <w:tc>
+          <w:tcPr>
+            <w:tcW w:type="dxa" w:w="1560"/>
+          </w:tcPr>
+          <w:p>
+            <w:r>
+              <w:t>WBS</w:t>
+            </w:r>
+          </w:p>
+        </w:tc>
+        <w:tc>
+          <w:tcPr>
+            <w:tcW w:type="dxa" w:w="3600"/>
+          </w:tcPr>
+          <w:p>
+            <w:r>
+              <w:t>Webster Financial Corp.</w:t>
+            </w:r>
+          </w:p>
+        </w:tc>
+        <w:tc>
+          <w:tcPr>
+            <w:tcW w:type="dxa" w:w="4200"/>
+          </w:tcPr>
+          <w:p>
+            <w:r>
+              <w:t>Stock</w:t>
+            </w:r>
+          </w:p>
+        </w:tc>
+      </w:tr>
+      <w:tr>
+        <w:tc>
+          <w:tcPr>
+            <w:tcW w:type="dxa" w:w="1560"/>
+          </w:tcPr>
+          <w:p>
+            <w:r>
+              <w:t>V</w:t>
+            </w:r>
+          </w:p>
+        </w:tc>
+        <w:tc>
+          <w:tcPr>
+            <w:tcW w:type="dxa" w:w="3600"/>
+          </w:tcPr>
+          <w:p>
+            <w:r>
+              <w:t>Visa Inc.</w:t>
+            </w:r>
+          </w:p>
+        </w:tc>
+        <w:tc>
+          <w:tcPr>
+            <w:tcW w:type="dxa" w:w="4200"/>
+          </w:tcPr>
+          <w:p>
+            <w:r>
+              <w:t>Stock</w:t>
+            </w:r>
+          </w:p>
+        </w:tc>
+      </w:tr>
+      <w:tr>
+        <w:tc>
+          <w:tcPr>
+            <w:tcW w:type="dxa" w:w="1560"/>
+          </w:tcPr>
+          <w:p>
+            <w:r>
+              <w:t>TT</w:t>
+            </w:r>
+          </w:p>
+        </w:tc>
+        <w:tc>
+          <w:tcPr>
+            <w:tcW w:type="dxa" w:w="3600"/>
+          </w:tcPr>
+          <w:p>
+            <w:r>
+              <w:t>Trane Technologies plc</w:t>
+            </w:r>
+          </w:p>
+        </w:tc>
+        <w:tc>
+          <w:tcPr>
+            <w:tcW w:type="dxa" w:w="4200"/>
+          </w:tcPr>
+          <w:p>
+            <w:r>
+              <w:t>Stock</w:t>
+            </w:r>
+          </w:p>
+        </w:tc>
+      </w:tr>
+      <w:tr>
+        <w:tc>
+          <w:tcPr>
+            <w:tcW w:type="dxa" w:w="1560"/>
+          </w:tcPr>
+          <w:p>
+            <w:r>
+              <w:t>OXY</w:t>
+            </w:r>
+          </w:p>
+        </w:tc>
+        <w:tc>
+          <w:tcPr>
+            <w:tcW w:type="dxa" w:w="3600"/>
+          </w:tcPr>
+          <w:p>
+            <w:r>
+              <w:t>Occidental Petroleum Corp.</w:t>
+            </w:r>
+          </w:p>
+        </w:tc>
+        <w:tc>
+          <w:tcPr>
+            <w:tcW w:type="dxa" w:w="4200"/>
+          </w:tcPr>
+          <w:p>
+            <w:r>
+              <w:t>Stock</w:t>
+            </w:r>
+          </w:p>
+        </w:tc>
+      </w:tr>
+      <w:tr>
+        <w:tc>
+          <w:tcPr>
+            <w:tcW w:type="dxa" w:w="1560"/>
+          </w:tcPr>
+          <w:p>
+            <w:r>
+              <w:t>MA</w:t>
+            </w:r>
+          </w:p>
+        </w:tc>
+        <w:tc>
+          <w:tcPr>
+            <w:tcW w:type="dxa" w:w="3600"/>
+          </w:tcPr>
+          <w:p>
+            <w:r>
+              <w:t>Mastercard Inc.</w:t>
+            </w:r>
+          </w:p>
+        </w:tc>
+        <w:tc>
+          <w:tcPr>
+            <w:tcW w:type="dxa" w:w="4200"/>
+          </w:tcPr>
+          <w:p>
+            <w:r>
+              <w:t>Stock</w:t>
+            </w:r>
+          </w:p>
+        </w:tc>
+      </w:tr>
+      <w:tr>
+        <w:tc>
+          <w:tcPr>
+            <w:tcW w:type="dxa" w:w="1560"/>
+          </w:tcPr>
+          <w:p>
+            <w:r>
+              <w:t>IJH</w:t>
+            </w:r>
+          </w:p>
+        </w:tc>
+        <w:tc>
+          <w:tcPr>
+            <w:tcW w:type="dxa" w:w="3600"/>
+          </w:tcPr>
+          <w:p>
+            <w:r>
+              <w:t>iShares Core S&amp;P Mid-Cap ETF</w:t>
+            </w:r>
+          </w:p>
+        </w:tc>
+        <w:tc>
+          <w:tcPr>
+            <w:tcW w:type="dxa" w:w="4200"/>
+          </w:tcPr>
+          <w:p>
+            <w:r>
+              <w:t>ETF</w:t>
+            </w:r>
+          </w:p>
+        </w:tc>
+      </w:tr>
+      <w:tr>
+        <w:tc>
+          <w:tcPr>
+            <w:tcW w:type="dxa" w:w="1560"/>
+          </w:tcPr>
+          <w:p>
+            <w:r>
+              <w:t>XLY</w:t>
+            </w:r>
+          </w:p>
+        </w:tc>
+        <w:tc>
+          <w:tcPr>
+            <w:tcW w:type="dxa" w:w="3600"/>
+          </w:tcPr>
+          <w:p>
+            <w:r>
+              <w:t>Consumer Discretionary Sector SPDR</w:t>
+            </w:r>
+          </w:p>
+        </w:tc>
+        <w:tc>
+          <w:tcPr>
+            <w:tcW w:type="dxa" w:w="4200"/>
+          </w:tcPr>
+          <w:p>
+            <w:r>
+              <w:t>Sector ETF</w:t>
+            </w:r>
+          </w:p>
+        </w:tc>
+      </w:tr>
+      <w:tr>
+        <w:tc>
+          <w:tcPr>
+            <w:tcW w:type="dxa" w:w="1560"/>
+          </w:tcPr>
+          <w:p>
+            <w:r>
+              <w:t>RSP</w:t>
+            </w:r>
+          </w:p>
+        </w:tc>
+        <w:tc>
+          <w:tcPr>
+            <w:tcW w:type="dxa" w:w="3600"/>
+          </w:tcPr>
+          <w:p>
+            <w:r>
+              <w:t>Invesco S&amp;P 500 Equal Weight ETF</w:t>
+            </w:r>
+          </w:p>
+        </w:tc>
+        <w:tc>
+          <w:tcPr>
+            <w:tcW w:type="dxa" w:w="4200"/>
+          </w:tcPr>
+          <w:p>
+            <w:r>
+              <w:t>ETF</w:t>
+            </w:r>
+          </w:p>
+        </w:tc>
+      </w:tr>
+      <w:tr>
+        <w:tc>
+          <w:tcPr>
+            <w:tcW w:type="dxa" w:w="1560"/>
+          </w:tcPr>
+          <w:p>
+            <w:r>
+              <w:t>BN</w:t>
+            </w:r>
+          </w:p>
+        </w:tc>
+        <w:tc>
+          <w:tcPr>
+            <w:tcW w:type="dxa" w:w="3600"/>
+          </w:tcPr>
+          <w:p>
+            <w:r>
+              <w:t>Brookfield Corp.</w:t>
+            </w:r>
+          </w:p>
+        </w:tc>
+        <w:tc>
+          <w:tcPr>
+            <w:tcW w:type="dxa" w:w="4200"/>
+          </w:tcPr>
+          <w:p>
+            <w:r>
+              <w:t>Stock</w:t>
+            </w:r>
+          </w:p>
+        </w:tc>
+      </w:tr>
+      <w:tr>
+        <w:tc>
+          <w:tcPr>
+            <w:tcW w:type="dxa" w:w="1560"/>
+          </w:tcPr>
+          <w:p>
+            <w:r>
+              <w:t>TDG</w:t>
+            </w:r>
+          </w:p>
+        </w:tc>
+        <w:tc>
+          <w:tcPr>
+            <w:tcW w:type="dxa" w:w="3600"/>
+          </w:tcPr>
+          <w:p>
+            <w:r>
+              <w:t>TransDigm Group Inc.</w:t>
+            </w:r>
+          </w:p>
+        </w:tc>
+        <w:tc>
+          <w:tcPr>
+            <w:tcW w:type="dxa" w:w="4200"/>
+          </w:tcPr>
+          <w:p>
+            <w:r>
+              <w:t>Stock</w:t>
+            </w:r>
+          </w:p>
+        </w:tc>
+      </w:tr>
+      <w:tr>
+        <w:tc>
+          <w:tcPr>
+            <w:tcW w:type="dxa" w:w="1560"/>
+          </w:tcPr>
+          <w:p>
+            <w:r>
+              <w:t>FANG</w:t>
+            </w:r>
+          </w:p>
+        </w:tc>
+        <w:tc>
+          <w:tcPr>
+            <w:tcW w:type="dxa" w:w="3600"/>
+          </w:tcPr>
+          <w:p>
+            <w:r>
+              <w:t>Diamondback Energy Inc.</w:t>
+            </w:r>
+          </w:p>
+        </w:tc>
+        <w:tc>
+          <w:tcPr>
+            <w:tcW w:type="dxa" w:w="4200"/>
+          </w:tcPr>
+          <w:p>
+            <w:r>
+              <w:t>Stock</w:t>
+            </w:r>
+          </w:p>
+        </w:tc>
+      </w:tr>
+      <w:tr>
+        <w:tc>
+          <w:tcPr>
+            <w:tcW w:type="dxa" w:w="1560"/>
+          </w:tcPr>
+          <w:p>
+            <w:r>
+              <w:t>COP</w:t>
+            </w:r>
+          </w:p>
+        </w:tc>
+        <w:tc>
+          <w:tcPr>
+            <w:tcW w:type="dxa" w:w="3600"/>
+          </w:tcPr>
+          <w:p>
+            <w:r>
+              <w:t>ConocoPhillips</w:t>
+            </w:r>
+          </w:p>
+        </w:tc>
+        <w:tc>
+          <w:tcPr>
+            <w:tcW w:type="dxa" w:w="4200"/>
+          </w:tcPr>
+          <w:p>
+            <w:r>
+              <w:t>Stock</w:t>
+            </w:r>
+          </w:p>
+        </w:tc>
+      </w:tr>
+      <w:tr>
+        <w:tc>
+          <w:tcPr>
+            <w:tcW w:type="dxa" w:w="1560"/>
+          </w:tcPr>
+          <w:p>
+            <w:r>
+              <w:t>EFA</w:t>
+            </w:r>
+          </w:p>
+        </w:tc>
+        <w:tc>
+          <w:tcPr>
+            <w:tcW w:type="dxa" w:w="3600"/>
+          </w:tcPr>
+          <w:p>
+            <w:r>
+              <w:t>iShares MSCI EAFE ETF</w:t>
+            </w:r>
+          </w:p>
+        </w:tc>
+        <w:tc>
+          <w:tcPr>
+            <w:tcW w:type="dxa" w:w="4200"/>
+          </w:tcPr>
+          <w:p>
+            <w:r>
+              <w:t>ETF</w:t>
+            </w:r>
+          </w:p>
+        </w:tc>
+      </w:tr>
+      <w:tr>
+        <w:tc>
+          <w:tcPr>
+            <w:tcW w:type="dxa" w:w="1560"/>
+          </w:tcPr>
+          <w:p>
+            <w:r>
+              <w:t>AXP</w:t>
+            </w:r>
+          </w:p>
+        </w:tc>
+        <w:tc>
+          <w:tcPr>
+            <w:tcW w:type="dxa" w:w="3600"/>
+          </w:tcPr>
+          <w:p>
+            <w:r>
+              <w:t>American Express Co.</w:t>
+            </w:r>
+          </w:p>
+        </w:tc>
+        <w:tc>
+          <w:tcPr>
+            <w:tcW w:type="dxa" w:w="4200"/>
+          </w:tcPr>
+          <w:p>
+            <w:r>
+              <w:t>Stock</w:t>
+            </w:r>
+          </w:p>
+        </w:tc>
+      </w:tr>
+      <w:tr>
+        <w:tc>
+          <w:tcPr>
+            <w:tcW w:type="dxa" w:w="1560"/>
+          </w:tcPr>
+          <w:p>
+            <w:r>
+              <w:t>XLF</w:t>
+            </w:r>
+          </w:p>
+        </w:tc>
+        <w:tc>
+          <w:tcPr>
+            <w:tcW w:type="dxa" w:w="3600"/>
+          </w:tcPr>
+          <w:p>
+            <w:r>
+              <w:t>Financial Select Sector SPDR</w:t>
+            </w:r>
+          </w:p>
+        </w:tc>
+        <w:tc>
+          <w:tcPr>
+            <w:tcW w:type="dxa" w:w="4200"/>
+          </w:tcPr>
+          <w:p>
+            <w:r>
+              <w:t>Sector ETF</w:t>
+            </w:r>
+          </w:p>
+        </w:tc>
+      </w:tr>
+      <w:tr>
+        <w:tc>
+          <w:tcPr>
+            <w:tcW w:type="dxa" w:w="1560"/>
+          </w:tcPr>
+          <w:p>
+            <w:r>
+              <w:t>LIN</w:t>
+            </w:r>
+          </w:p>
+        </w:tc>
+        <w:tc>
+          <w:tcPr>
+            <w:tcW w:type="dxa" w:w="3600"/>
+          </w:tcPr>
+          <w:p>
+            <w:r>
+              <w:t>Linde plc</w:t>
+            </w:r>
+          </w:p>
+        </w:tc>
+        <w:tc>
+          <w:tcPr>
+            <w:tcW w:type="dxa" w:w="4200"/>
+          </w:tcPr>
+          <w:p>
+            <w:r>
+              <w:t>Stock</w:t>
+            </w:r>
+          </w:p>
+        </w:tc>
+      </w:tr>
+      <w:tr>
+        <w:tc>
+          <w:tcPr>
+            <w:tcW w:type="dxa" w:w="1560"/>
+          </w:tcPr>
+          <w:p>
+            <w:r>
+              <w:t>KVUE</w:t>
+            </w:r>
+          </w:p>
+        </w:tc>
+        <w:tc>
+          <w:tcPr>
+            <w:tcW w:type="dxa" w:w="3600"/>
+          </w:tcPr>
+          <w:p>
+            <w:r>
+              <w:t>Kenvue Inc.</w:t>
+            </w:r>
+          </w:p>
+        </w:tc>
+        <w:tc>
+          <w:tcPr>
+            <w:tcW w:type="dxa" w:w="4200"/>
+          </w:tcPr>
+          <w:p>
+            <w:r>
+              <w:t>Stock</w:t>
+            </w:r>
+          </w:p>
+        </w:tc>
+      </w:tr>
+      <w:tr>
+        <w:tc>
+          <w:tcPr>
+            <w:tcW w:type="dxa" w:w="1560"/>
+          </w:tcPr>
+          <w:p>
+            <w:r>
+              <w:t>HWM</w:t>
+            </w:r>
+          </w:p>
+        </w:tc>
+        <w:tc>
+          <w:tcPr>
+            <w:tcW w:type="dxa" w:w="3600"/>
+          </w:tcPr>
+          <w:p>
+            <w:r>
+              <w:t>Howmet Aerospace Inc.</w:t>
+            </w:r>
+          </w:p>
+        </w:tc>
+        <w:tc>
+          <w:tcPr>
+            <w:tcW w:type="dxa" w:w="4200"/>
+          </w:tcPr>
+          <w:p>
+            <w:r>
+              <w:t>Stock</w:t>
+            </w:r>
+          </w:p>
+        </w:tc>
+      </w:tr>
+      <w:tr>
+        <w:tc>
+          <w:tcPr>
+            <w:tcW w:type="dxa" w:w="1560"/>
+          </w:tcPr>
+          <w:p>
+            <w:r>
+              <w:t>IEFA</w:t>
+            </w:r>
+          </w:p>
+        </w:tc>
+        <w:tc>
+          <w:tcPr>
+            <w:tcW w:type="dxa" w:w="3600"/>
+          </w:tcPr>
+          <w:p>
+            <w:r>
+              <w:t>iShares Core MSCI EAFE ETF</w:t>
+            </w:r>
+          </w:p>
+        </w:tc>
+        <w:tc>
+          <w:tcPr>
+            <w:tcW w:type="dxa" w:w="4200"/>
+          </w:tcPr>
+          <w:p>
+            <w:r>
+              <w:t>ETF</w:t>
+            </w:r>
+          </w:p>
+        </w:tc>
+      </w:tr>
+      <w:tr>
+        <w:tc>
+          <w:tcPr>
+            <w:tcW w:type="dxa" w:w="1560"/>
+          </w:tcPr>
+          <w:p>
+            <w:r>
+              <w:t>XOP</w:t>
+            </w:r>
+          </w:p>
+        </w:tc>
+        <w:tc>
+          <w:tcPr>
+            <w:tcW w:type="dxa" w:w="3600"/>
+          </w:tcPr>
+          <w:p>
+            <w:r>
+              <w:t>SPDR S&amp;P Oil &amp; Gas E&amp;P ETF</w:t>
+            </w:r>
+          </w:p>
+        </w:tc>
+        <w:tc>
+          <w:tcPr>
+            <w:tcW w:type="dxa" w:w="4200"/>
+          </w:tcPr>
+          <w:p>
+            <w:r>
+              <w:t>Sector ETF</w:t>
+            </w:r>
+          </w:p>
+        </w:tc>
+      </w:tr>
+      <w:tr>
+        <w:tc>
+          <w:tcPr>
+            <w:tcW w:type="dxa" w:w="1560"/>
+          </w:tcPr>
+          <w:p>
+            <w:r>
+              <w:t>XRT</w:t>
+            </w:r>
+          </w:p>
+        </w:tc>
+        <w:tc>
+          <w:tcPr>
+            <w:tcW w:type="dxa" w:w="3600"/>
+          </w:tcPr>
+          <w:p>
+            <w:r>
+              <w:t>SPDR S&amp;P Retail ETF</w:t>
+            </w:r>
+          </w:p>
+        </w:tc>
+        <w:tc>
+          <w:tcPr>
+            <w:tcW w:type="dxa" w:w="4200"/>
+          </w:tcPr>
+          <w:p>
+            <w:r>
+              <w:t>Sector ETF</w:t>
+            </w:r>
+          </w:p>
+        </w:tc>
+      </w:tr>
+      <w:tr>
+        <w:tc>
+          <w:tcPr>
+            <w:tcW w:type="dxa" w:w="1560"/>
+          </w:tcPr>
+          <w:p>
+            <w:r>
+              <w:t>DIS</w:t>
+            </w:r>
+          </w:p>
+        </w:tc>
+        <w:tc>
+          <w:tcPr>
+            <w:tcW w:type="dxa" w:w="3600"/>
+          </w:tcPr>
+          <w:p>
+            <w:r>
+              <w:t>Walt Disney Co.</w:t>
+            </w:r>
+          </w:p>
+        </w:tc>
+        <w:tc>
+          <w:tcPr>
+            <w:tcW w:type="dxa" w:w="4200"/>
+          </w:tcPr>
+          <w:p>
+            <w:r>
+              <w:t>Stock</w:t>
+            </w:r>
+          </w:p>
+        </w:tc>
+      </w:tr>
+      <w:tr>
+        <w:tc>
+          <w:tcPr>
+            <w:tcW w:type="dxa" w:w="1560"/>
+          </w:tcPr>
+          <w:p>
+            <w:r>
+              <w:t>VGK</w:t>
+            </w:r>
+          </w:p>
+        </w:tc>
+        <w:tc>
+          <w:tcPr>
+            <w:tcW w:type="dxa" w:w="3600"/>
+          </w:tcPr>
+          <w:p>
+            <w:r>
+              <w:t>Vanguard FTSE Europe ETF</w:t>
+            </w:r>
+          </w:p>
+        </w:tc>
+        <w:tc>
+          <w:tcPr>
+            <w:tcW w:type="dxa" w:w="4200"/>
+          </w:tcPr>
+          <w:p>
+            <w:r>
+              <w:t>ETF</w:t>
             </w:r>
           </w:p>
         </w:tc>
@@ -1536,7 +2328,7 @@
         <w:pStyle w:val="Heading2"/>
       </w:pPr>
       <w:r>
-        <w:t>2B. SPDR Sector ETFs (XL Family)</w:t>
+        <w:t>2B. Selection Method (screener.py)</w:t>
       </w:r>
     </w:p>
     <w:tbl>
@@ -1597,7 +2389,7 @@
                 <w:sz w:val="20"/>
                 <w:szCs w:val="20"/>
               </w:rPr>
-              <w:t>Ticker</w:t>
+              <w:t>Criterion</w:t>
             </w:r>
           </w:p>
         </w:tc>
@@ -1627,7 +2419,7 @@
                 <w:sz w:val="20"/>
                 <w:szCs w:val="20"/>
               </w:rPr>
-              <w:t>Sector</w:t>
+              <w:t>Setting</w:t>
             </w:r>
           </w:p>
         </w:tc>
@@ -1657,7 +2449,7 @@
                 <w:sz w:val="20"/>
                 <w:szCs w:val="20"/>
               </w:rPr>
-              <w:t>Description</w:t>
+              <w:t>Notes</w:t>
             </w:r>
           </w:p>
         </w:tc>
@@ -1693,7 +2485,7 @@
                 <w:sz w:val="20"/>
                 <w:szCs w:val="20"/>
               </w:rPr>
-              <w:t>XLC</w:t>
+              <w:t>Universe scanned</w:t>
             </w:r>
           </w:p>
         </w:tc>
@@ -1721,7 +2513,7 @@
                 <w:sz w:val="20"/>
                 <w:szCs w:val="20"/>
               </w:rPr>
-              <w:t>Communication Services</w:t>
+              <w:t>All tradable Alpaca US equities</w:t>
             </w:r>
           </w:p>
         </w:tc>
@@ -1749,7 +2541,7 @@
                 <w:sz w:val="20"/>
                 <w:szCs w:val="20"/>
               </w:rPr>
-              <w:t>Telecom, media, internet services</w:t>
+              <w:t>~12,500 names</w:t>
             </w:r>
           </w:p>
         </w:tc>
@@ -1785,7 +2577,7 @@
                 <w:sz w:val="20"/>
                 <w:szCs w:val="20"/>
               </w:rPr>
-              <w:t>XLY</w:t>
+              <w:t>Liquidity floor</w:t>
             </w:r>
           </w:p>
         </w:tc>
@@ -1813,7 +2605,7 @@
                 <w:sz w:val="20"/>
                 <w:szCs w:val="20"/>
               </w:rPr>
-              <w:t>Consumer Discretionary</w:t>
+              <w:t>Dollar volume ≥ $20M/day AND price ≥ $5</w:t>
             </w:r>
           </w:p>
         </w:tc>
@@ -1841,7 +2633,7 @@
                 <w:sz w:val="20"/>
                 <w:szCs w:val="20"/>
               </w:rPr>
-              <w:t>Retail, autos, leisure</w:t>
+              <w:t>Stage-1 pre-filter</w:t>
             </w:r>
           </w:p>
         </w:tc>
@@ -1877,7 +2669,7 @@
                 <w:sz w:val="20"/>
                 <w:szCs w:val="20"/>
               </w:rPr>
-              <w:t>XLP</w:t>
+              <w:t>Sideways score</w:t>
             </w:r>
           </w:p>
         </w:tc>
@@ -1905,7 +2697,7 @@
                 <w:sz w:val="20"/>
                 <w:szCs w:val="20"/>
               </w:rPr>
-              <w:t>Consumer Staples</w:t>
+              <w:t>0.5×low-ADX + 0.3×range-bound + 0.2×liquidity</w:t>
             </w:r>
           </w:p>
         </w:tc>
@@ -1933,7 +2725,7 @@
                 <w:sz w:val="20"/>
                 <w:szCs w:val="20"/>
               </w:rPr>
-              <w:t>Food, beverage, household products</w:t>
+              <w:t>0–100, ranked desc</w:t>
             </w:r>
           </w:p>
         </w:tc>
@@ -1969,7 +2761,7 @@
                 <w:sz w:val="20"/>
                 <w:szCs w:val="20"/>
               </w:rPr>
-              <w:t>XLE</w:t>
+              <w:t>Selection</w:t>
             </w:r>
           </w:p>
         </w:tc>
@@ -1997,7 +2789,7 @@
                 <w:sz w:val="20"/>
                 <w:szCs w:val="20"/>
               </w:rPr>
-              <w:t>Energy</w:t>
+              <w:t>Top 30 by score</w:t>
             </w:r>
           </w:p>
         </w:tc>
@@ -2025,7 +2817,7 @@
                 <w:sz w:val="20"/>
                 <w:szCs w:val="20"/>
               </w:rPr>
-              <w:t>Oil, gas, energy companies</w:t>
+              <w:t>written to screener_results.csv</w:t>
             </w:r>
           </w:p>
         </w:tc>
@@ -2061,7 +2853,7 @@
                 <w:sz w:val="20"/>
                 <w:szCs w:val="20"/>
               </w:rPr>
-              <w:t>XLF</w:t>
+              <w:t>Refresh</w:t>
             </w:r>
           </w:p>
         </w:tc>
@@ -2089,7 +2881,7 @@
                 <w:sz w:val="20"/>
                 <w:szCs w:val="20"/>
               </w:rPr>
-              <w:t>Financials</w:t>
+              <w:t>Re-run screener.py, paste top 30 into config.SYMBOLS</w:t>
             </w:r>
           </w:p>
         </w:tc>
@@ -2117,559 +2909,7 @@
                 <w:sz w:val="20"/>
                 <w:szCs w:val="20"/>
               </w:rPr>
-              <w:t>Banks, insurance, investment firms</w:t>
-            </w:r>
-          </w:p>
-        </w:tc>
-      </w:tr>
-      <w:tr>
-        <w:tblPrEx>
-          <w:tblCellMar>
-            <w:top w:w="0" w:type="dxa"/>
-            <w:bottom w:w="0" w:type="dxa"/>
-          </w:tblCellMar>
-        </w:tblPrEx>
-        <w:tc>
-          <w:tcPr>
-            <w:tcW w:w="1200" w:type="dxa"/>
-            <w:tcBorders>
-              <w:top w:val="single" w:sz="1" w:space="0" w:color="CCCCCC"/>
-              <w:left w:val="single" w:sz="1" w:space="0" w:color="CCCCCC"/>
-              <w:bottom w:val="single" w:sz="1" w:space="0" w:color="CCCCCC"/>
-              <w:right w:val="single" w:sz="1" w:space="0" w:color="CCCCCC"/>
-            </w:tcBorders>
-            <w:shd w:val="clear" w:color="auto" w:fill="F2F2F2"/>
-            <w:tcMar>
-              <w:top w:w="100" w:type="dxa"/>
-              <w:left w:w="150" w:type="dxa"/>
-              <w:bottom w:w="100" w:type="dxa"/>
-              <w:right w:w="150" w:type="dxa"/>
-            </w:tcMar>
-          </w:tcPr>
-          <w:p>
-            <w:r>
-              <w:rPr>
-                <w:color w:val="000000"/>
-                <w:sz w:val="20"/>
-                <w:szCs w:val="20"/>
-              </w:rPr>
-              <w:t>XLV</w:t>
-            </w:r>
-          </w:p>
-        </w:tc>
-        <w:tc>
-          <w:tcPr>
-            <w:tcW w:w="2880" w:type="dxa"/>
-            <w:tcBorders>
-              <w:top w:val="single" w:sz="1" w:space="0" w:color="CCCCCC"/>
-              <w:left w:val="single" w:sz="1" w:space="0" w:color="CCCCCC"/>
-              <w:bottom w:val="single" w:sz="1" w:space="0" w:color="CCCCCC"/>
-              <w:right w:val="single" w:sz="1" w:space="0" w:color="CCCCCC"/>
-            </w:tcBorders>
-            <w:shd w:val="clear" w:color="auto" w:fill="F2F2F2"/>
-            <w:tcMar>
-              <w:top w:w="100" w:type="dxa"/>
-              <w:left w:w="150" w:type="dxa"/>
-              <w:bottom w:w="100" w:type="dxa"/>
-              <w:right w:w="150" w:type="dxa"/>
-            </w:tcMar>
-          </w:tcPr>
-          <w:p>
-            <w:r>
-              <w:rPr>
-                <w:color w:val="000000"/>
-                <w:sz w:val="20"/>
-                <w:szCs w:val="20"/>
-              </w:rPr>
-              <w:t>Health Care</w:t>
-            </w:r>
-          </w:p>
-        </w:tc>
-        <w:tc>
-          <w:tcPr>
-            <w:tcW w:w="5280" w:type="dxa"/>
-            <w:tcBorders>
-              <w:top w:val="single" w:sz="1" w:space="0" w:color="CCCCCC"/>
-              <w:left w:val="single" w:sz="1" w:space="0" w:color="CCCCCC"/>
-              <w:bottom w:val="single" w:sz="1" w:space="0" w:color="CCCCCC"/>
-              <w:right w:val="single" w:sz="1" w:space="0" w:color="CCCCCC"/>
-            </w:tcBorders>
-            <w:shd w:val="clear" w:color="auto" w:fill="F2F2F2"/>
-            <w:tcMar>
-              <w:top w:w="100" w:type="dxa"/>
-              <w:left w:w="150" w:type="dxa"/>
-              <w:bottom w:w="100" w:type="dxa"/>
-              <w:right w:w="150" w:type="dxa"/>
-            </w:tcMar>
-          </w:tcPr>
-          <w:p>
-            <w:r>
-              <w:rPr>
-                <w:color w:val="000000"/>
-                <w:sz w:val="20"/>
-                <w:szCs w:val="20"/>
-              </w:rPr>
-              <w:t>Pharma, biotech, medical devices</w:t>
-            </w:r>
-          </w:p>
-        </w:tc>
-      </w:tr>
-      <w:tr>
-        <w:tblPrEx>
-          <w:tblCellMar>
-            <w:top w:w="0" w:type="dxa"/>
-            <w:bottom w:w="0" w:type="dxa"/>
-          </w:tblCellMar>
-        </w:tblPrEx>
-        <w:tc>
-          <w:tcPr>
-            <w:tcW w:w="1200" w:type="dxa"/>
-            <w:tcBorders>
-              <w:top w:val="single" w:sz="1" w:space="0" w:color="CCCCCC"/>
-              <w:left w:val="single" w:sz="1" w:space="0" w:color="CCCCCC"/>
-              <w:bottom w:val="single" w:sz="1" w:space="0" w:color="CCCCCC"/>
-              <w:right w:val="single" w:sz="1" w:space="0" w:color="CCCCCC"/>
-            </w:tcBorders>
-            <w:shd w:val="clear" w:color="auto" w:fill="FFFFFF"/>
-            <w:tcMar>
-              <w:top w:w="100" w:type="dxa"/>
-              <w:left w:w="150" w:type="dxa"/>
-              <w:bottom w:w="100" w:type="dxa"/>
-              <w:right w:w="150" w:type="dxa"/>
-            </w:tcMar>
-          </w:tcPr>
-          <w:p>
-            <w:r>
-              <w:rPr>
-                <w:color w:val="000000"/>
-                <w:sz w:val="20"/>
-                <w:szCs w:val="20"/>
-              </w:rPr>
-              <w:t>XLI</w:t>
-            </w:r>
-          </w:p>
-        </w:tc>
-        <w:tc>
-          <w:tcPr>
-            <w:tcW w:w="2880" w:type="dxa"/>
-            <w:tcBorders>
-              <w:top w:val="single" w:sz="1" w:space="0" w:color="CCCCCC"/>
-              <w:left w:val="single" w:sz="1" w:space="0" w:color="CCCCCC"/>
-              <w:bottom w:val="single" w:sz="1" w:space="0" w:color="CCCCCC"/>
-              <w:right w:val="single" w:sz="1" w:space="0" w:color="CCCCCC"/>
-            </w:tcBorders>
-            <w:shd w:val="clear" w:color="auto" w:fill="FFFFFF"/>
-            <w:tcMar>
-              <w:top w:w="100" w:type="dxa"/>
-              <w:left w:w="150" w:type="dxa"/>
-              <w:bottom w:w="100" w:type="dxa"/>
-              <w:right w:w="150" w:type="dxa"/>
-            </w:tcMar>
-          </w:tcPr>
-          <w:p>
-            <w:r>
-              <w:rPr>
-                <w:color w:val="000000"/>
-                <w:sz w:val="20"/>
-                <w:szCs w:val="20"/>
-              </w:rPr>
-              <w:t>Industrials</w:t>
-            </w:r>
-          </w:p>
-        </w:tc>
-        <w:tc>
-          <w:tcPr>
-            <w:tcW w:w="5280" w:type="dxa"/>
-            <w:tcBorders>
-              <w:top w:val="single" w:sz="1" w:space="0" w:color="CCCCCC"/>
-              <w:left w:val="single" w:sz="1" w:space="0" w:color="CCCCCC"/>
-              <w:bottom w:val="single" w:sz="1" w:space="0" w:color="CCCCCC"/>
-              <w:right w:val="single" w:sz="1" w:space="0" w:color="CCCCCC"/>
-            </w:tcBorders>
-            <w:shd w:val="clear" w:color="auto" w:fill="FFFFFF"/>
-            <w:tcMar>
-              <w:top w:w="100" w:type="dxa"/>
-              <w:left w:w="150" w:type="dxa"/>
-              <w:bottom w:w="100" w:type="dxa"/>
-              <w:right w:w="150" w:type="dxa"/>
-            </w:tcMar>
-          </w:tcPr>
-          <w:p>
-            <w:r>
-              <w:rPr>
-                <w:color w:val="000000"/>
-                <w:sz w:val="20"/>
-                <w:szCs w:val="20"/>
-              </w:rPr>
-              <w:t>Aerospace, defense, machinery</w:t>
-            </w:r>
-          </w:p>
-        </w:tc>
-      </w:tr>
-      <w:tr>
-        <w:tblPrEx>
-          <w:tblCellMar>
-            <w:top w:w="0" w:type="dxa"/>
-            <w:bottom w:w="0" w:type="dxa"/>
-          </w:tblCellMar>
-        </w:tblPrEx>
-        <w:tc>
-          <w:tcPr>
-            <w:tcW w:w="1200" w:type="dxa"/>
-            <w:tcBorders>
-              <w:top w:val="single" w:sz="1" w:space="0" w:color="CCCCCC"/>
-              <w:left w:val="single" w:sz="1" w:space="0" w:color="CCCCCC"/>
-              <w:bottom w:val="single" w:sz="1" w:space="0" w:color="CCCCCC"/>
-              <w:right w:val="single" w:sz="1" w:space="0" w:color="CCCCCC"/>
-            </w:tcBorders>
-            <w:shd w:val="clear" w:color="auto" w:fill="F2F2F2"/>
-            <w:tcMar>
-              <w:top w:w="100" w:type="dxa"/>
-              <w:left w:w="150" w:type="dxa"/>
-              <w:bottom w:w="100" w:type="dxa"/>
-              <w:right w:w="150" w:type="dxa"/>
-            </w:tcMar>
-          </w:tcPr>
-          <w:p>
-            <w:r>
-              <w:rPr>
-                <w:color w:val="000000"/>
-                <w:sz w:val="20"/>
-                <w:szCs w:val="20"/>
-              </w:rPr>
-              <w:t>XLB</w:t>
-            </w:r>
-          </w:p>
-        </w:tc>
-        <w:tc>
-          <w:tcPr>
-            <w:tcW w:w="2880" w:type="dxa"/>
-            <w:tcBorders>
-              <w:top w:val="single" w:sz="1" w:space="0" w:color="CCCCCC"/>
-              <w:left w:val="single" w:sz="1" w:space="0" w:color="CCCCCC"/>
-              <w:bottom w:val="single" w:sz="1" w:space="0" w:color="CCCCCC"/>
-              <w:right w:val="single" w:sz="1" w:space="0" w:color="CCCCCC"/>
-            </w:tcBorders>
-            <w:shd w:val="clear" w:color="auto" w:fill="F2F2F2"/>
-            <w:tcMar>
-              <w:top w:w="100" w:type="dxa"/>
-              <w:left w:w="150" w:type="dxa"/>
-              <w:bottom w:w="100" w:type="dxa"/>
-              <w:right w:w="150" w:type="dxa"/>
-            </w:tcMar>
-          </w:tcPr>
-          <w:p>
-            <w:r>
-              <w:rPr>
-                <w:color w:val="000000"/>
-                <w:sz w:val="20"/>
-                <w:szCs w:val="20"/>
-              </w:rPr>
-              <w:t>Materials</w:t>
-            </w:r>
-          </w:p>
-        </w:tc>
-        <w:tc>
-          <w:tcPr>
-            <w:tcW w:w="5280" w:type="dxa"/>
-            <w:tcBorders>
-              <w:top w:val="single" w:sz="1" w:space="0" w:color="CCCCCC"/>
-              <w:left w:val="single" w:sz="1" w:space="0" w:color="CCCCCC"/>
-              <w:bottom w:val="single" w:sz="1" w:space="0" w:color="CCCCCC"/>
-              <w:right w:val="single" w:sz="1" w:space="0" w:color="CCCCCC"/>
-            </w:tcBorders>
-            <w:shd w:val="clear" w:color="auto" w:fill="F2F2F2"/>
-            <w:tcMar>
-              <w:top w:w="100" w:type="dxa"/>
-              <w:left w:w="150" w:type="dxa"/>
-              <w:bottom w:w="100" w:type="dxa"/>
-              <w:right w:w="150" w:type="dxa"/>
-            </w:tcMar>
-          </w:tcPr>
-          <w:p>
-            <w:r>
-              <w:rPr>
-                <w:color w:val="000000"/>
-                <w:sz w:val="20"/>
-                <w:szCs w:val="20"/>
-              </w:rPr>
-              <w:t>Chemicals, metals, mining</w:t>
-            </w:r>
-          </w:p>
-        </w:tc>
-      </w:tr>
-      <w:tr>
-        <w:tblPrEx>
-          <w:tblCellMar>
-            <w:top w:w="0" w:type="dxa"/>
-            <w:bottom w:w="0" w:type="dxa"/>
-          </w:tblCellMar>
-        </w:tblPrEx>
-        <w:tc>
-          <w:tcPr>
-            <w:tcW w:w="1200" w:type="dxa"/>
-            <w:tcBorders>
-              <w:top w:val="single" w:sz="1" w:space="0" w:color="CCCCCC"/>
-              <w:left w:val="single" w:sz="1" w:space="0" w:color="CCCCCC"/>
-              <w:bottom w:val="single" w:sz="1" w:space="0" w:color="CCCCCC"/>
-              <w:right w:val="single" w:sz="1" w:space="0" w:color="CCCCCC"/>
-            </w:tcBorders>
-            <w:shd w:val="clear" w:color="auto" w:fill="FFFFFF"/>
-            <w:tcMar>
-              <w:top w:w="100" w:type="dxa"/>
-              <w:left w:w="150" w:type="dxa"/>
-              <w:bottom w:w="100" w:type="dxa"/>
-              <w:right w:w="150" w:type="dxa"/>
-            </w:tcMar>
-          </w:tcPr>
-          <w:p>
-            <w:r>
-              <w:rPr>
-                <w:color w:val="000000"/>
-                <w:sz w:val="20"/>
-                <w:szCs w:val="20"/>
-              </w:rPr>
-              <w:t>XLRE</w:t>
-            </w:r>
-          </w:p>
-        </w:tc>
-        <w:tc>
-          <w:tcPr>
-            <w:tcW w:w="2880" w:type="dxa"/>
-            <w:tcBorders>
-              <w:top w:val="single" w:sz="1" w:space="0" w:color="CCCCCC"/>
-              <w:left w:val="single" w:sz="1" w:space="0" w:color="CCCCCC"/>
-              <w:bottom w:val="single" w:sz="1" w:space="0" w:color="CCCCCC"/>
-              <w:right w:val="single" w:sz="1" w:space="0" w:color="CCCCCC"/>
-            </w:tcBorders>
-            <w:shd w:val="clear" w:color="auto" w:fill="FFFFFF"/>
-            <w:tcMar>
-              <w:top w:w="100" w:type="dxa"/>
-              <w:left w:w="150" w:type="dxa"/>
-              <w:bottom w:w="100" w:type="dxa"/>
-              <w:right w:w="150" w:type="dxa"/>
-            </w:tcMar>
-          </w:tcPr>
-          <w:p>
-            <w:r>
-              <w:rPr>
-                <w:color w:val="000000"/>
-                <w:sz w:val="20"/>
-                <w:szCs w:val="20"/>
-              </w:rPr>
-              <w:t>Real Estate</w:t>
-            </w:r>
-          </w:p>
-        </w:tc>
-        <w:tc>
-          <w:tcPr>
-            <w:tcW w:w="5280" w:type="dxa"/>
-            <w:tcBorders>
-              <w:top w:val="single" w:sz="1" w:space="0" w:color="CCCCCC"/>
-              <w:left w:val="single" w:sz="1" w:space="0" w:color="CCCCCC"/>
-              <w:bottom w:val="single" w:sz="1" w:space="0" w:color="CCCCCC"/>
-              <w:right w:val="single" w:sz="1" w:space="0" w:color="CCCCCC"/>
-            </w:tcBorders>
-            <w:shd w:val="clear" w:color="auto" w:fill="FFFFFF"/>
-            <w:tcMar>
-              <w:top w:w="100" w:type="dxa"/>
-              <w:left w:w="150" w:type="dxa"/>
-              <w:bottom w:w="100" w:type="dxa"/>
-              <w:right w:w="150" w:type="dxa"/>
-            </w:tcMar>
-          </w:tcPr>
-          <w:p>
-            <w:r>
-              <w:rPr>
-                <w:color w:val="000000"/>
-                <w:sz w:val="20"/>
-                <w:szCs w:val="20"/>
-              </w:rPr>
-              <w:t>REITs, real estate management</w:t>
-            </w:r>
-          </w:p>
-        </w:tc>
-      </w:tr>
-      <w:tr>
-        <w:tblPrEx>
-          <w:tblCellMar>
-            <w:top w:w="0" w:type="dxa"/>
-            <w:bottom w:w="0" w:type="dxa"/>
-          </w:tblCellMar>
-        </w:tblPrEx>
-        <w:tc>
-          <w:tcPr>
-            <w:tcW w:w="1200" w:type="dxa"/>
-            <w:tcBorders>
-              <w:top w:val="single" w:sz="1" w:space="0" w:color="CCCCCC"/>
-              <w:left w:val="single" w:sz="1" w:space="0" w:color="CCCCCC"/>
-              <w:bottom w:val="single" w:sz="1" w:space="0" w:color="CCCCCC"/>
-              <w:right w:val="single" w:sz="1" w:space="0" w:color="CCCCCC"/>
-            </w:tcBorders>
-            <w:shd w:val="clear" w:color="auto" w:fill="F2F2F2"/>
-            <w:tcMar>
-              <w:top w:w="100" w:type="dxa"/>
-              <w:left w:w="150" w:type="dxa"/>
-              <w:bottom w:w="100" w:type="dxa"/>
-              <w:right w:w="150" w:type="dxa"/>
-            </w:tcMar>
-          </w:tcPr>
-          <w:p>
-            <w:r>
-              <w:rPr>
-                <w:color w:val="000000"/>
-                <w:sz w:val="20"/>
-                <w:szCs w:val="20"/>
-              </w:rPr>
-              <w:t>XLK</w:t>
-            </w:r>
-          </w:p>
-        </w:tc>
-        <w:tc>
-          <w:tcPr>
-            <w:tcW w:w="2880" w:type="dxa"/>
-            <w:tcBorders>
-              <w:top w:val="single" w:sz="1" w:space="0" w:color="CCCCCC"/>
-              <w:left w:val="single" w:sz="1" w:space="0" w:color="CCCCCC"/>
-              <w:bottom w:val="single" w:sz="1" w:space="0" w:color="CCCCCC"/>
-              <w:right w:val="single" w:sz="1" w:space="0" w:color="CCCCCC"/>
-            </w:tcBorders>
-            <w:shd w:val="clear" w:color="auto" w:fill="F2F2F2"/>
-            <w:tcMar>
-              <w:top w:w="100" w:type="dxa"/>
-              <w:left w:w="150" w:type="dxa"/>
-              <w:bottom w:w="100" w:type="dxa"/>
-              <w:right w:w="150" w:type="dxa"/>
-            </w:tcMar>
-          </w:tcPr>
-          <w:p>
-            <w:r>
-              <w:rPr>
-                <w:color w:val="000000"/>
-                <w:sz w:val="20"/>
-                <w:szCs w:val="20"/>
-              </w:rPr>
-              <w:t>Technology</w:t>
-            </w:r>
-          </w:p>
-        </w:tc>
-        <w:tc>
-          <w:tcPr>
-            <w:tcW w:w="5280" w:type="dxa"/>
-            <w:tcBorders>
-              <w:top w:val="single" w:sz="1" w:space="0" w:color="CCCCCC"/>
-              <w:left w:val="single" w:sz="1" w:space="0" w:color="CCCCCC"/>
-              <w:bottom w:val="single" w:sz="1" w:space="0" w:color="CCCCCC"/>
-              <w:right w:val="single" w:sz="1" w:space="0" w:color="CCCCCC"/>
-            </w:tcBorders>
-            <w:shd w:val="clear" w:color="auto" w:fill="F2F2F2"/>
-            <w:tcMar>
-              <w:top w:w="100" w:type="dxa"/>
-              <w:left w:w="150" w:type="dxa"/>
-              <w:bottom w:w="100" w:type="dxa"/>
-              <w:right w:w="150" w:type="dxa"/>
-            </w:tcMar>
-          </w:tcPr>
-          <w:p>
-            <w:r>
-              <w:rPr>
-                <w:color w:val="000000"/>
-                <w:sz w:val="20"/>
-                <w:szCs w:val="20"/>
-              </w:rPr>
-              <w:t>Software, hardware, semiconductors</w:t>
-            </w:r>
-          </w:p>
-        </w:tc>
-      </w:tr>
-      <w:tr>
-        <w:tblPrEx>
-          <w:tblCellMar>
-            <w:top w:w="0" w:type="dxa"/>
-            <w:bottom w:w="0" w:type="dxa"/>
-          </w:tblCellMar>
-        </w:tblPrEx>
-        <w:tc>
-          <w:tcPr>
-            <w:tcW w:w="1200" w:type="dxa"/>
-            <w:tcBorders>
-              <w:top w:val="single" w:sz="1" w:space="0" w:color="CCCCCC"/>
-              <w:left w:val="single" w:sz="1" w:space="0" w:color="CCCCCC"/>
-              <w:bottom w:val="single" w:sz="1" w:space="0" w:color="CCCCCC"/>
-              <w:right w:val="single" w:sz="1" w:space="0" w:color="CCCCCC"/>
-            </w:tcBorders>
-            <w:shd w:val="clear" w:color="auto" w:fill="FFFFFF"/>
-            <w:tcMar>
-              <w:top w:w="100" w:type="dxa"/>
-              <w:left w:w="150" w:type="dxa"/>
-              <w:bottom w:w="100" w:type="dxa"/>
-              <w:right w:w="150" w:type="dxa"/>
-            </w:tcMar>
-          </w:tcPr>
-          <w:p>
-            <w:r>
-              <w:rPr>
-                <w:color w:val="000000"/>
-                <w:sz w:val="20"/>
-                <w:szCs w:val="20"/>
-              </w:rPr>
-              <w:t>XLU</w:t>
-            </w:r>
-          </w:p>
-        </w:tc>
-        <w:tc>
-          <w:tcPr>
-            <w:tcW w:w="2880" w:type="dxa"/>
-            <w:tcBorders>
-              <w:top w:val="single" w:sz="1" w:space="0" w:color="CCCCCC"/>
-              <w:left w:val="single" w:sz="1" w:space="0" w:color="CCCCCC"/>
-              <w:bottom w:val="single" w:sz="1" w:space="0" w:color="CCCCCC"/>
-              <w:right w:val="single" w:sz="1" w:space="0" w:color="CCCCCC"/>
-            </w:tcBorders>
-            <w:shd w:val="clear" w:color="auto" w:fill="FFFFFF"/>
-            <w:tcMar>
-              <w:top w:w="100" w:type="dxa"/>
-              <w:left w:w="150" w:type="dxa"/>
-              <w:bottom w:w="100" w:type="dxa"/>
-              <w:right w:w="150" w:type="dxa"/>
-            </w:tcMar>
-          </w:tcPr>
-          <w:p>
-            <w:r>
-              <w:rPr>
-                <w:color w:val="000000"/>
-                <w:sz w:val="20"/>
-                <w:szCs w:val="20"/>
-              </w:rPr>
-              <w:t>Utilities</w:t>
-            </w:r>
-          </w:p>
-        </w:tc>
-        <w:tc>
-          <w:tcPr>
-            <w:tcW w:w="5280" w:type="dxa"/>
-            <w:tcBorders>
-              <w:top w:val="single" w:sz="1" w:space="0" w:color="CCCCCC"/>
-              <w:left w:val="single" w:sz="1" w:space="0" w:color="CCCCCC"/>
-              <w:bottom w:val="single" w:sz="1" w:space="0" w:color="CCCCCC"/>
-              <w:right w:val="single" w:sz="1" w:space="0" w:color="CCCCCC"/>
-            </w:tcBorders>
-            <w:shd w:val="clear" w:color="auto" w:fill="FFFFFF"/>
-            <w:tcMar>
-              <w:top w:w="100" w:type="dxa"/>
-              <w:left w:w="150" w:type="dxa"/>
-              <w:bottom w:w="100" w:type="dxa"/>
-              <w:right w:w="150" w:type="dxa"/>
-            </w:tcMar>
-          </w:tcPr>
-          <w:p>
-            <w:r>
-              <w:rPr>
-                <w:color w:val="000000"/>
-                <w:sz w:val="20"/>
-                <w:szCs w:val="20"/>
-              </w:rPr>
-              <w:t>Electric, gas, water utilities</w:t>
+              <w:t>manual, not automatic</w:t>
             </w:r>
           </w:p>
         </w:tc>
@@ -2700,8 +2940,7 @@
           <w:b/>
           <w:bCs/>
         </w:rPr>
-        <w:lastRenderedPageBreak/>
-        <w:t>All three timeframe checks must pass before a trade is entered. If any layer fails, no trade is taken.</w:t>
+        <w:t>As of v1.2 the daily RSI(2) signal is the only hard entry filter. The weekly SMA trend gate, the daily SMA(50) gate, and the weekly ADX regime check are DISABLED.</w:t>
       </w:r>
     </w:p>
     <w:p>
@@ -2958,7 +3197,7 @@
           </w:tcPr>
           <w:p>
             <w:r>
-              <w:t>STOP — No Trade</w:t>
+              <w:t>DISABLED (v1.2) — not checked</w:t>
             </w:r>
           </w:p>
         </w:tc>
@@ -3058,7 +3297,7 @@
           </w:tcPr>
           <w:p>
             <w:r>
-              <w:t>STOP — No Trade</w:t>
+              <w:t>DISABLED (v1.2) — not checked</w:t>
             </w:r>
           </w:p>
         </w:tc>
@@ -3158,7 +3397,7 @@
           </w:tcPr>
           <w:p>
             <w:r>
-              <w:t>STOP — No Trade</w:t>
+              <w:t>DISABLED (v1.2) — not checked</w:t>
             </w:r>
           </w:p>
         </w:tc>
@@ -3527,7 +3766,7 @@
         <w:pStyle w:val="Heading2"/>
       </w:pPr>
       <w:r>
-        <w:t>4A. Weekly Timeframe — Trend Gatekeeper (HARD FILTER)</w:t>
+        <w:t>4A. Weekly Timeframe — Trend Gatekeeper (DISABLED v1.2)</w:t>
       </w:r>
     </w:p>
     <w:p>
@@ -3535,7 +3774,7 @@
         <w:spacing w:before="80" w:after="80"/>
       </w:pPr>
       <w:r>
-        <w:t>The weekly chart is your first line of defense. If the big picture trend is broken, do not proceed.</w:t>
+        <w:t>DISABLED as of v1.2 (USE_TREND_FILTER=False). Retained for reference. The weekly SMA(50)/SMA(200) gate is no longer enforced, so range-bound names that sit below their long-term averages can still trade.</w:t>
       </w:r>
     </w:p>
     <w:p>
@@ -3704,13 +3943,13 @@
         <w:pStyle w:val="Heading2"/>
       </w:pPr>
       <w:r>
-        <w:t>4A.5 Weekly Timeframe — Regime Strength Gate (HARD FILTER)</w:t>
+        <w:t>4A.5 Weekly Timeframe — Regime Strength Gate (DISABLED v1.2)</w:t>
       </w:r>
     </w:p>
     <w:p>
       <w:pPr/>
       <w:r>
-        <w:t>After the weekly SMA gate passes, a second weekly check confirms the trend has the right STRENGTH. This is a hard filter — it is enforced live and in backtest via config USE_REGIME_FILTER.</w:t>
+        <w:t>DISABLED as of v1.2 (USE_REGIME_FILTER=False). Retained for reference. The sideways universe has low weekly ADX (~8–15), which the [20, 25) band would block — so the regime gate is turned off.</w:t>
       </w:r>
     </w:p>
     <w:p>
@@ -3795,7 +4034,7 @@
           <w:b/>
           <w:bCs/>
         </w:rPr>
-        <w:t>Price must be ABOVE the 50-day SMA</w:t>
+        <w:t>Price above the 50-day SMA — DISABLED v1.2 (no longer required to enter)</w:t>
       </w:r>
     </w:p>
     <w:p>
@@ -4547,7 +4786,7 @@
                 <w:sz w:val="20"/>
                 <w:szCs w:val="20"/>
               </w:rPr>
-              <w:t>Structural trend is broken — original thesis is invalid</w:t>
+              <w:t>DISABLED (v1.2, USE_TREND_FILTER=False) — structural trend exit not enforced for the sideways universe</w:t>
             </w:r>
           </w:p>
         </w:tc>
@@ -5781,7 +6020,7 @@
                 <w:sz w:val="20"/>
                 <w:szCs w:val="20"/>
               </w:rPr>
-              <w:t>Intermediate trend filter</w:t>
+              <w:t>Intermediate trend filter (DISABLED v1.2)</w:t>
             </w:r>
           </w:p>
         </w:tc>
@@ -5901,7 +6140,7 @@
                 <w:sz w:val="20"/>
                 <w:szCs w:val="20"/>
               </w:rPr>
-              <w:t>Long-term trend filter</w:t>
+              <w:t>Long-term trend filter (DISABLED v1.2)</w:t>
             </w:r>
           </w:p>
         </w:tc>
@@ -6021,7 +6260,7 @@
                 <w:sz w:val="20"/>
                 <w:szCs w:val="20"/>
               </w:rPr>
-              <w:t>Medium-term trend filter</w:t>
+              <w:t>Medium-term trend filter (DISABLED v1.2)</w:t>
             </w:r>
           </w:p>
         </w:tc>
@@ -6518,7 +6757,7 @@
           </w:tcPr>
           <w:p>
             <w:r>
-              <w:t>Regime strength gate — enter only in [20, 25)</w:t>
+              <w:t>Regime strength gate — DISABLED v1.2</w:t>
             </w:r>
           </w:p>
         </w:tc>
@@ -6757,7 +6996,7 @@
           </w:tcPr>
           <w:p>
             <w:r>
-              <w:t>Price is above SMA(50)</w:t>
+              <w:t>Price is above SMA(50) — DISABLED (v1.2)</w:t>
             </w:r>
           </w:p>
         </w:tc>
@@ -6855,7 +7094,7 @@
           </w:tcPr>
           <w:p>
             <w:r>
-              <w:t>Price is above SMA(200)</w:t>
+              <w:t>Price is above SMA(200) — DISABLED (v1.2)</w:t>
             </w:r>
           </w:p>
         </w:tc>
@@ -6953,7 +7192,7 @@
           </w:tcPr>
           <w:p>
             <w:r>
-              <w:t>Weekly ADX(14) within regime band [20, 25)</w:t>
+              <w:t>Weekly ADX(14) within regime band [20, 25) — DISABLED (v1.2)</w:t>
             </w:r>
           </w:p>
         </w:tc>
@@ -7051,7 +7290,7 @@
           </w:tcPr>
           <w:p>
             <w:r>
-              <w:t>Price is above SMA(50)</w:t>
+              <w:t>Price is above SMA(50) — DISABLED (v1.2)</w:t>
             </w:r>
           </w:p>
         </w:tc>
@@ -7670,7 +7909,7 @@
         <w:spacing w:before="60" w:after="60"/>
       </w:pPr>
       <w:r>
-        <w:t>Never trade below the weekly SMA filters — no exceptions</w:t>
+        <w:t>Follow the system's active filters — the weekly/daily SMA gates are OFF in v1.2 (USE_TREND_FILTER=False); do not re-impose them manually</w:t>
       </w:r>
     </w:p>
     <w:p>
@@ -7894,8 +8133,7 @@
           <w:iCs/>
           <w:color w:val="555555"/>
         </w:rPr>
-        <w:lastRenderedPageBreak/>
-        <w:t>Backtest</w:t>
+        <w:t>Backtest priority: Run on SPY first (longest history, most liquid), then expand to the full sideways universe from screener.py.</w:t>
       </w:r>
       <w:proofErr w:type="spellEnd"/>
       <w:r>
@@ -7904,7 +8142,6 @@
           <w:iCs/>
           <w:color w:val="555555"/>
         </w:rPr>
-        <w:t xml:space="preserve"> priority: Run on SPY first (longest history, most liquid), then expand to full 16-ETF universe.</w:t>
       </w:r>
     </w:p>
     <w:p>
@@ -7918,6 +8155,36 @@
       </w:pPr>
       <w:r>
         <w:t>11. Revision History</w:t>
+      </w:r>
+    </w:p>
+    <w:p>
+      <w:pPr/>
+      <w:r>
+        <w:t>Version 1.2 — June 15, 2026. Changes made to bring the rulebook in line with the live code:</w:t>
+      </w:r>
+    </w:p>
+    <w:p>
+      <w:pPr>
+        <w:pStyle w:val="ListParagraph"/>
+      </w:pPr>
+      <w:r>
+        <w:t>Universe switched from the fixed 16-ETF list to the top 30 range-bound (“sideways”) names selected by screener.py. screener.py scans every tradable Alpaca US equity, applies a liquidity pre-filter, and ranks names by a combined sideways score (low ADX + price hugging its mean + liquidity).</w:t>
+      </w:r>
+    </w:p>
+    <w:p>
+      <w:pPr>
+        <w:pStyle w:val="ListParagraph"/>
+      </w:pPr>
+      <w:r>
+        <w:t>Weekly trend gate DISABLED (USE_TREND_FILTER=False): entries no longer require price above the weekly SMA(50)/SMA(200) or the daily SMA(50), and the weekly-SMA(200) structural exit is turned off too — otherwise it would dump sideways names that naturally sit below their 4-year average.</w:t>
+      </w:r>
+    </w:p>
+    <w:p>
+      <w:pPr>
+        <w:pStyle w:val="ListParagraph"/>
+      </w:pPr>
+      <w:r>
+        <w:t>Weekly ADX regime band [20, 25) DISABLED (USE_REGIME_FILTER=False): the sideways universe has low ADX (~8–15) that the band would block.</w:t>
       </w:r>
     </w:p>
     <w:p>

</xml_diff>

<commit_message>
Sync rulebook to v1.3 (refreshed universe + sector cap)
Update the 30-name universe table with sectors, add a Sector Cap row and
position-sizing/rule bullets for MAX_PER_SECTOR=2, and add a v1.3
Revision History entry. Snapshot v1.2.

Co-Authored-By: Claude Opus 4.8 <noreply@anthropic.com>
</commit_message>
<xml_diff>
--- a/Mean_Reversion_Rulebook_1.docx
+++ b/Mean_Reversion_Rulebook_1.docx
@@ -135,7 +135,7 @@
       <w:proofErr w:type="gramStart"/>
       <w:proofErr w:type="gramEnd"/>
       <w:r>
-        <w:t>Version 1.2  |  Updated June 15, 2026</w:t>
+        <w:t>Version 1.3  |  Updated June 15, 2026</w:t>
       </w:r>
     </w:p>
     <w:p>
@@ -156,7 +156,7 @@
       <w:proofErr w:type="gramStart"/>
       <w:proofErr w:type="gramEnd"/>
       <w:r>
-        <w:t>This rulebook defines a systematic mean reversion swing trading strategy based on Larry Connors' RSI(2) methodology with disciplined risk management. As of v1.2 the universe is the top 30 range-bound (“sideways”) names selected by screener.py, and the trend overlays — the weekly SMA(50)/SMA(200) gate, the daily SMA(50) gate, and the weekly ADX regime band — are DISABLED so the strategy trades pure mean reversion regardless of trend. Volume is also computed and logged but not used as an entry filter (see Section 11).</w:t>
+        <w:t>This rulebook defines a systematic mean reversion swing trading strategy based on Larry Connors' RSI(2) methodology with disciplined risk management. As of v1.2 the universe is the top range-bound (“sideways”) names from screener.py with the weekly trend/regime overlays disabled (pure daily mean reversion). v1.3 refreshes that universe — now a mix of individual stocks plus sector, bond, and international ETFs, each tagged by sector — and adds a per-sector position cap (max 2 open positions per sector) on top of the 5-position portfolio cap. Volume is computed and logged but not used as an entry filter (see Section 11).</w:t>
       </w:r>
     </w:p>
     <w:p>
@@ -640,7 +640,7 @@
                 <w:sz w:val="20"/>
                 <w:szCs w:val="20"/>
               </w:rPr>
-              <w:t>Top 30 sideways names selected by screener.py (v1.2)</w:t>
+              <w:t>Top 30 sideways names — stocks + sector/bond/intl ETFs (screener.py, v1.3)</w:t>
             </w:r>
           </w:p>
         </w:tc>
@@ -873,6 +873,28 @@
           <w:p>
             <w:r>
               <w:t>DISABLED (v1.2) — was weekly ADX(14) in [20, 25)</w:t>
+            </w:r>
+          </w:p>
+        </w:tc>
+      </w:tr>
+      <w:tr>
+        <w:tc>
+          <w:tcPr>
+            <w:tcW w:type="dxa" w:w="3600"/>
+          </w:tcPr>
+          <w:p>
+            <w:r>
+              <w:t>Sector Cap</w:t>
+            </w:r>
+          </w:p>
+        </w:tc>
+        <w:tc>
+          <w:tcPr>
+            <w:tcW w:type="dxa" w:w="5760"/>
+          </w:tcPr>
+          <w:p>
+            <w:r>
+              <w:t>Max 2 open positions per sector (v1.3) — see sectors.py</w:t>
             </w:r>
           </w:p>
         </w:tc>
@@ -1020,7 +1042,7 @@
                 <w:sz w:val="20"/>
                 <w:szCs w:val="20"/>
               </w:rPr>
-              <w:t>Type</w:t>
+              <w:t>Sector (Type)</w:t>
             </w:r>
           </w:p>
         </w:tc>
@@ -1056,7 +1078,7 @@
                 <w:sz w:val="20"/>
                 <w:szCs w:val="20"/>
               </w:rPr>
-              <w:t>XLE</w:t>
+              <w:t>SPGI</w:t>
             </w:r>
           </w:p>
         </w:tc>
@@ -1084,7 +1106,7 @@
                 <w:sz w:val="20"/>
                 <w:szCs w:val="20"/>
               </w:rPr>
-              <w:t>Energy Select Sector SPDR</w:t>
+              <w:t>S&amp;P Global Inc.</w:t>
             </w:r>
           </w:p>
         </w:tc>
@@ -1112,7 +1134,7 @@
                 <w:sz w:val="20"/>
                 <w:szCs w:val="20"/>
               </w:rPr>
-              <w:t>Sector ETF</w:t>
+              <w:t>Financials (Stock)</w:t>
             </w:r>
           </w:p>
         </w:tc>
@@ -1148,7 +1170,7 @@
                 <w:sz w:val="20"/>
                 <w:szCs w:val="20"/>
               </w:rPr>
-              <w:t>XLI</w:t>
+              <w:t>EFA</w:t>
             </w:r>
           </w:p>
         </w:tc>
@@ -1176,7 +1198,7 @@
                 <w:sz w:val="20"/>
                 <w:szCs w:val="20"/>
               </w:rPr>
-              <w:t>Industrial Select Sector SPDR</w:t>
+              <w:t>iShares MSCI EAFE ETF</w:t>
             </w:r>
           </w:p>
         </w:tc>
@@ -1204,7 +1226,7 @@
                 <w:sz w:val="20"/>
                 <w:szCs w:val="20"/>
               </w:rPr>
-              <w:t>Sector ETF</w:t>
+              <w:t>Broad/Index (ETF)</w:t>
             </w:r>
           </w:p>
         </w:tc>
@@ -1240,7 +1262,7 @@
                 <w:sz w:val="20"/>
                 <w:szCs w:val="20"/>
               </w:rPr>
-              <w:t>XBI</w:t>
+              <w:t>MA</w:t>
             </w:r>
           </w:p>
         </w:tc>
@@ -1268,7 +1290,7 @@
                 <w:sz w:val="20"/>
                 <w:szCs w:val="20"/>
               </w:rPr>
-              <w:t>SPDR S&amp;P Biotech ETF</w:t>
+              <w:t>Mastercard Inc.</w:t>
             </w:r>
           </w:p>
         </w:tc>
@@ -1296,7 +1318,7 @@
                 <w:sz w:val="20"/>
                 <w:szCs w:val="20"/>
               </w:rPr>
-              <w:t>Sector ETF</w:t>
+              <w:t>Financials (Stock)</w:t>
             </w:r>
           </w:p>
         </w:tc>
@@ -1332,7 +1354,7 @@
                 <w:sz w:val="20"/>
                 <w:szCs w:val="20"/>
               </w:rPr>
-              <w:t>SPGI</w:t>
+              <w:t>LQD</w:t>
             </w:r>
           </w:p>
         </w:tc>
@@ -1360,7 +1382,7 @@
                 <w:sz w:val="20"/>
                 <w:szCs w:val="20"/>
               </w:rPr>
-              <w:t>S&amp;P Global Inc.</w:t>
+              <w:t>iShares iBoxx IG Corp Bond ETF</w:t>
             </w:r>
           </w:p>
         </w:tc>
@@ -1388,7 +1410,7 @@
                 <w:sz w:val="20"/>
                 <w:szCs w:val="20"/>
               </w:rPr>
-              <w:t>Stock</w:t>
+              <w:t>Broad/Index (ETF)</w:t>
             </w:r>
           </w:p>
         </w:tc>
@@ -1424,7 +1446,7 @@
                 <w:sz w:val="20"/>
                 <w:szCs w:val="20"/>
               </w:rPr>
-              <w:t>EOG</w:t>
+              <w:t>XBI</w:t>
             </w:r>
           </w:p>
         </w:tc>
@@ -1452,7 +1474,7 @@
                 <w:sz w:val="20"/>
                 <w:szCs w:val="20"/>
               </w:rPr>
-              <w:t>EOG Resources Inc.</w:t>
+              <w:t>SPDR S&amp;P Biotech ETF</w:t>
             </w:r>
             <w:proofErr w:type="spellStart"/>
             <w:r>
@@ -1496,7 +1518,7 @@
                 <w:sz w:val="20"/>
                 <w:szCs w:val="20"/>
               </w:rPr>
-              <w:t>Stock</w:t>
+              <w:t>Health Care (Sector ETF)</w:t>
             </w:r>
             <w:proofErr w:type="spellStart"/>
             <w:r>
@@ -1524,7 +1546,7 @@
           </w:tcPr>
           <w:p>
             <w:r>
-              <w:t>XOM</w:t>
+              <w:t>XLI</w:t>
             </w:r>
           </w:p>
         </w:tc>
@@ -1534,7 +1556,7 @@
           </w:tcPr>
           <w:p>
             <w:r>
-              <w:t>Exxon Mobil Corp.</w:t>
+              <w:t>Industrial Select Sector SPDR</w:t>
             </w:r>
           </w:p>
         </w:tc>
@@ -1544,7 +1566,7 @@
           </w:tcPr>
           <w:p>
             <w:r>
-              <w:t>Stock</w:t>
+              <w:t>Industrials (Sector ETF)</w:t>
             </w:r>
           </w:p>
         </w:tc>
@@ -1556,7 +1578,7 @@
           </w:tcPr>
           <w:p>
             <w:r>
-              <w:t>CVX</w:t>
+              <w:t>IEFA</w:t>
             </w:r>
           </w:p>
         </w:tc>
@@ -1566,7 +1588,7 @@
           </w:tcPr>
           <w:p>
             <w:r>
-              <w:t>Chevron Corp.</w:t>
+              <w:t>iShares Core MSCI EAFE ETF</w:t>
             </w:r>
           </w:p>
         </w:tc>
@@ -1576,7 +1598,7 @@
           </w:tcPr>
           <w:p>
             <w:r>
-              <w:t>Stock</w:t>
+              <w:t>Broad/Index (ETF)</w:t>
             </w:r>
           </w:p>
         </w:tc>
@@ -1588,7 +1610,7 @@
           </w:tcPr>
           <w:p>
             <w:r>
-              <w:t>WBS</w:t>
+              <w:t>XLE</w:t>
             </w:r>
           </w:p>
         </w:tc>
@@ -1598,7 +1620,7 @@
           </w:tcPr>
           <w:p>
             <w:r>
-              <w:t>Webster Financial Corp.</w:t>
+              <w:t>Energy Select Sector SPDR</w:t>
             </w:r>
           </w:p>
         </w:tc>
@@ -1608,7 +1630,7 @@
           </w:tcPr>
           <w:p>
             <w:r>
-              <w:t>Stock</w:t>
+              <w:t>Energy (Sector ETF)</w:t>
             </w:r>
           </w:p>
         </w:tc>
@@ -1620,7 +1642,7 @@
           </w:tcPr>
           <w:p>
             <w:r>
-              <w:t>V</w:t>
+              <w:t>TDG</w:t>
             </w:r>
           </w:p>
         </w:tc>
@@ -1630,7 +1652,7 @@
           </w:tcPr>
           <w:p>
             <w:r>
-              <w:t>Visa Inc.</w:t>
+              <w:t>TransDigm Group Inc.</w:t>
             </w:r>
           </w:p>
         </w:tc>
@@ -1640,7 +1662,7 @@
           </w:tcPr>
           <w:p>
             <w:r>
-              <w:t>Stock</w:t>
+              <w:t>Industrials (Stock)</w:t>
             </w:r>
           </w:p>
         </w:tc>
@@ -1652,7 +1674,7 @@
           </w:tcPr>
           <w:p>
             <w:r>
-              <w:t>TT</w:t>
+              <w:t>SCHW</w:t>
             </w:r>
           </w:p>
         </w:tc>
@@ -1662,7 +1684,7 @@
           </w:tcPr>
           <w:p>
             <w:r>
-              <w:t>Trane Technologies plc</w:t>
+              <w:t>Charles Schwab Corp.</w:t>
             </w:r>
           </w:p>
         </w:tc>
@@ -1672,7 +1694,7 @@
           </w:tcPr>
           <w:p>
             <w:r>
-              <w:t>Stock</w:t>
+              <w:t>Financials (Stock)</w:t>
             </w:r>
           </w:p>
         </w:tc>
@@ -1684,7 +1706,7 @@
           </w:tcPr>
           <w:p>
             <w:r>
-              <w:t>OXY</w:t>
+              <w:t>VGK</w:t>
             </w:r>
           </w:p>
         </w:tc>
@@ -1694,7 +1716,7 @@
           </w:tcPr>
           <w:p>
             <w:r>
-              <w:t>Occidental Petroleum Corp.</w:t>
+              <w:t>Vanguard FTSE Europe ETF</w:t>
             </w:r>
           </w:p>
         </w:tc>
@@ -1704,7 +1726,7 @@
           </w:tcPr>
           <w:p>
             <w:r>
-              <w:t>Stock</w:t>
+              <w:t>Broad/Index (ETF)</w:t>
             </w:r>
           </w:p>
         </w:tc>
@@ -1716,7 +1738,7 @@
           </w:tcPr>
           <w:p>
             <w:r>
-              <w:t>MA</w:t>
+              <w:t>EMB</w:t>
             </w:r>
           </w:p>
         </w:tc>
@@ -1726,7 +1748,7 @@
           </w:tcPr>
           <w:p>
             <w:r>
-              <w:t>Mastercard Inc.</w:t>
+              <w:t>iShares JPM USD EM Bond ETF</w:t>
             </w:r>
           </w:p>
         </w:tc>
@@ -1736,7 +1758,7 @@
           </w:tcPr>
           <w:p>
             <w:r>
-              <w:t>Stock</w:t>
+              <w:t>Broad/Index (ETF)</w:t>
             </w:r>
           </w:p>
         </w:tc>
@@ -1748,7 +1770,7 @@
           </w:tcPr>
           <w:p>
             <w:r>
-              <w:t>IJH</w:t>
+              <w:t>IDXX</w:t>
             </w:r>
           </w:p>
         </w:tc>
@@ -1758,7 +1780,7 @@
           </w:tcPr>
           <w:p>
             <w:r>
-              <w:t>iShares Core S&amp;P Mid-Cap ETF</w:t>
+              <w:t>IDEXX Laboratories Inc.</w:t>
             </w:r>
           </w:p>
         </w:tc>
@@ -1768,7 +1790,7 @@
           </w:tcPr>
           <w:p>
             <w:r>
-              <w:t>ETF</w:t>
+              <w:t>Health Care (Stock)</w:t>
             </w:r>
           </w:p>
         </w:tc>
@@ -1780,7 +1802,7 @@
           </w:tcPr>
           <w:p>
             <w:r>
-              <w:t>XLY</w:t>
+              <w:t>DIS</w:t>
             </w:r>
           </w:p>
         </w:tc>
@@ -1790,7 +1812,7 @@
           </w:tcPr>
           <w:p>
             <w:r>
-              <w:t>Consumer Discretionary Sector SPDR</w:t>
+              <w:t>Walt Disney Co.</w:t>
             </w:r>
           </w:p>
         </w:tc>
@@ -1800,7 +1822,7 @@
           </w:tcPr>
           <w:p>
             <w:r>
-              <w:t>Sector ETF</w:t>
+              <w:t>Communication Services (Stock)</w:t>
             </w:r>
           </w:p>
         </w:tc>
@@ -1812,7 +1834,7 @@
           </w:tcPr>
           <w:p>
             <w:r>
-              <w:t>RSP</w:t>
+              <w:t>EOG</w:t>
             </w:r>
           </w:p>
         </w:tc>
@@ -1822,7 +1844,7 @@
           </w:tcPr>
           <w:p>
             <w:r>
-              <w:t>Invesco S&amp;P 500 Equal Weight ETF</w:t>
+              <w:t>EOG Resources Inc.</w:t>
             </w:r>
           </w:p>
         </w:tc>
@@ -1832,7 +1854,7 @@
           </w:tcPr>
           <w:p>
             <w:r>
-              <w:t>ETF</w:t>
+              <w:t>Energy (Stock)</w:t>
             </w:r>
           </w:p>
         </w:tc>
@@ -1844,7 +1866,7 @@
           </w:tcPr>
           <w:p>
             <w:r>
-              <w:t>BN</w:t>
+              <w:t>AMGN</w:t>
             </w:r>
           </w:p>
         </w:tc>
@@ -1854,7 +1876,7 @@
           </w:tcPr>
           <w:p>
             <w:r>
-              <w:t>Brookfield Corp.</w:t>
+              <w:t>Amgen Inc.</w:t>
             </w:r>
           </w:p>
         </w:tc>
@@ -1864,7 +1886,7 @@
           </w:tcPr>
           <w:p>
             <w:r>
-              <w:t>Stock</w:t>
+              <w:t>Health Care (Stock)</w:t>
             </w:r>
           </w:p>
         </w:tc>
@@ -1876,7 +1898,7 @@
           </w:tcPr>
           <w:p>
             <w:r>
-              <w:t>TDG</w:t>
+              <w:t>HYG</w:t>
             </w:r>
           </w:p>
         </w:tc>
@@ -1886,7 +1908,7 @@
           </w:tcPr>
           <w:p>
             <w:r>
-              <w:t>TransDigm Group Inc.</w:t>
+              <w:t>iShares iBoxx HY Corp Bond ETF</w:t>
             </w:r>
           </w:p>
         </w:tc>
@@ -1896,7 +1918,7 @@
           </w:tcPr>
           <w:p>
             <w:r>
-              <w:t>Stock</w:t>
+              <w:t>Broad/Index (ETF)</w:t>
             </w:r>
           </w:p>
         </w:tc>
@@ -1908,7 +1930,7 @@
           </w:tcPr>
           <w:p>
             <w:r>
-              <w:t>FANG</w:t>
+              <w:t>VCLT</w:t>
             </w:r>
           </w:p>
         </w:tc>
@@ -1918,7 +1940,7 @@
           </w:tcPr>
           <w:p>
             <w:r>
-              <w:t>Diamondback Energy Inc.</w:t>
+              <w:t>Vanguard Long-Term Corp Bond ETF</w:t>
             </w:r>
           </w:p>
         </w:tc>
@@ -1928,7 +1950,7 @@
           </w:tcPr>
           <w:p>
             <w:r>
-              <w:t>Stock</w:t>
+              <w:t>Broad/Index (ETF)</w:t>
             </w:r>
           </w:p>
         </w:tc>
@@ -1940,7 +1962,7 @@
           </w:tcPr>
           <w:p>
             <w:r>
-              <w:t>COP</w:t>
+              <w:t>TLT</w:t>
             </w:r>
           </w:p>
         </w:tc>
@@ -1950,7 +1972,7 @@
           </w:tcPr>
           <w:p>
             <w:r>
-              <w:t>ConocoPhillips</w:t>
+              <w:t>iShares 20+ Year Treasury ETF</w:t>
             </w:r>
           </w:p>
         </w:tc>
@@ -1960,7 +1982,7 @@
           </w:tcPr>
           <w:p>
             <w:r>
-              <w:t>Stock</w:t>
+              <w:t>Broad/Index (ETF)</w:t>
             </w:r>
           </w:p>
         </w:tc>
@@ -1972,7 +1994,7 @@
           </w:tcPr>
           <w:p>
             <w:r>
-              <w:t>EFA</w:t>
+              <w:t>V</w:t>
             </w:r>
           </w:p>
         </w:tc>
@@ -1982,7 +2004,7 @@
           </w:tcPr>
           <w:p>
             <w:r>
-              <w:t>iShares MSCI EAFE ETF</w:t>
+              <w:t>Visa Inc.</w:t>
             </w:r>
           </w:p>
         </w:tc>
@@ -1992,7 +2014,7 @@
           </w:tcPr>
           <w:p>
             <w:r>
-              <w:t>ETF</w:t>
+              <w:t>Financials (Stock)</w:t>
             </w:r>
           </w:p>
         </w:tc>
@@ -2004,7 +2026,7 @@
           </w:tcPr>
           <w:p>
             <w:r>
-              <w:t>AXP</w:t>
+              <w:t>LIN</w:t>
             </w:r>
           </w:p>
         </w:tc>
@@ -2014,7 +2036,7 @@
           </w:tcPr>
           <w:p>
             <w:r>
-              <w:t>American Express Co.</w:t>
+              <w:t>Linde plc</w:t>
             </w:r>
           </w:p>
         </w:tc>
@@ -2024,7 +2046,7 @@
           </w:tcPr>
           <w:p>
             <w:r>
-              <w:t>Stock</w:t>
+              <w:t>Materials (Stock)</w:t>
             </w:r>
           </w:p>
         </w:tc>
@@ -2036,7 +2058,7 @@
           </w:tcPr>
           <w:p>
             <w:r>
-              <w:t>XLF</w:t>
+              <w:t>CVX</w:t>
             </w:r>
           </w:p>
         </w:tc>
@@ -2046,7 +2068,7 @@
           </w:tcPr>
           <w:p>
             <w:r>
-              <w:t>Financial Select Sector SPDR</w:t>
+              <w:t>Chevron Corp.</w:t>
             </w:r>
           </w:p>
         </w:tc>
@@ -2056,7 +2078,7 @@
           </w:tcPr>
           <w:p>
             <w:r>
-              <w:t>Sector ETF</w:t>
+              <w:t>Energy (Stock)</w:t>
             </w:r>
           </w:p>
         </w:tc>
@@ -2068,7 +2090,7 @@
           </w:tcPr>
           <w:p>
             <w:r>
-              <w:t>LIN</w:t>
+              <w:t>XOM</w:t>
             </w:r>
           </w:p>
         </w:tc>
@@ -2078,7 +2100,7 @@
           </w:tcPr>
           <w:p>
             <w:r>
-              <w:t>Linde plc</w:t>
+              <w:t>Exxon Mobil Corp.</w:t>
             </w:r>
           </w:p>
         </w:tc>
@@ -2088,7 +2110,7 @@
           </w:tcPr>
           <w:p>
             <w:r>
-              <w:t>Stock</w:t>
+              <w:t>Energy (Stock)</w:t>
             </w:r>
           </w:p>
         </w:tc>
@@ -2100,7 +2122,7 @@
           </w:tcPr>
           <w:p>
             <w:r>
-              <w:t>KVUE</w:t>
+              <w:t>EZU</w:t>
             </w:r>
           </w:p>
         </w:tc>
@@ -2110,7 +2132,7 @@
           </w:tcPr>
           <w:p>
             <w:r>
-              <w:t>Kenvue Inc.</w:t>
+              <w:t>iShares MSCI Eurozone ETF</w:t>
             </w:r>
           </w:p>
         </w:tc>
@@ -2120,7 +2142,7 @@
           </w:tcPr>
           <w:p>
             <w:r>
-              <w:t>Stock</w:t>
+              <w:t>Broad/Index (ETF)</w:t>
             </w:r>
           </w:p>
         </w:tc>
@@ -2132,7 +2154,7 @@
           </w:tcPr>
           <w:p>
             <w:r>
-              <w:t>HWM</w:t>
+              <w:t>FANG</w:t>
             </w:r>
           </w:p>
         </w:tc>
@@ -2142,7 +2164,7 @@
           </w:tcPr>
           <w:p>
             <w:r>
-              <w:t>Howmet Aerospace Inc.</w:t>
+              <w:t>Diamondback Energy Inc.</w:t>
             </w:r>
           </w:p>
         </w:tc>
@@ -2152,7 +2174,7 @@
           </w:tcPr>
           <w:p>
             <w:r>
-              <w:t>Stock</w:t>
+              <w:t>Energy (Stock)</w:t>
             </w:r>
           </w:p>
         </w:tc>
@@ -2164,7 +2186,7 @@
           </w:tcPr>
           <w:p>
             <w:r>
-              <w:t>IEFA</w:t>
+              <w:t>UBER</w:t>
             </w:r>
           </w:p>
         </w:tc>
@@ -2174,7 +2196,7 @@
           </w:tcPr>
           <w:p>
             <w:r>
-              <w:t>iShares Core MSCI EAFE ETF</w:t>
+              <w:t>Uber Technologies Inc.</w:t>
             </w:r>
           </w:p>
         </w:tc>
@@ -2184,7 +2206,7 @@
           </w:tcPr>
           <w:p>
             <w:r>
-              <w:t>ETF</w:t>
+              <w:t>Technology (Stock)</w:t>
             </w:r>
           </w:p>
         </w:tc>
@@ -2196,7 +2218,7 @@
           </w:tcPr>
           <w:p>
             <w:r>
-              <w:t>XOP</w:t>
+              <w:t>XLP</w:t>
             </w:r>
           </w:p>
         </w:tc>
@@ -2206,7 +2228,7 @@
           </w:tcPr>
           <w:p>
             <w:r>
-              <w:t>SPDR S&amp;P Oil &amp; Gas E&amp;P ETF</w:t>
+              <w:t>Consumer Staples Select SPDR</w:t>
             </w:r>
           </w:p>
         </w:tc>
@@ -2216,7 +2238,7 @@
           </w:tcPr>
           <w:p>
             <w:r>
-              <w:t>Sector ETF</w:t>
+              <w:t>Consumer Staples (Sector ETF)</w:t>
             </w:r>
           </w:p>
         </w:tc>
@@ -2228,7 +2250,7 @@
           </w:tcPr>
           <w:p>
             <w:r>
-              <w:t>XRT</w:t>
+              <w:t>MRK</w:t>
             </w:r>
           </w:p>
         </w:tc>
@@ -2238,7 +2260,7 @@
           </w:tcPr>
           <w:p>
             <w:r>
-              <w:t>SPDR S&amp;P Retail ETF</w:t>
+              <w:t>Merck &amp; Co. Inc.</w:t>
             </w:r>
           </w:p>
         </w:tc>
@@ -2248,7 +2270,7 @@
           </w:tcPr>
           <w:p>
             <w:r>
-              <w:t>Sector ETF</w:t>
+              <w:t>Health Care (Stock)</w:t>
             </w:r>
           </w:p>
         </w:tc>
@@ -2260,7 +2282,7 @@
           </w:tcPr>
           <w:p>
             <w:r>
-              <w:t>DIS</w:t>
+              <w:t>ABNB</w:t>
             </w:r>
           </w:p>
         </w:tc>
@@ -2270,7 +2292,7 @@
           </w:tcPr>
           <w:p>
             <w:r>
-              <w:t>Walt Disney Co.</w:t>
+              <w:t>Airbnb Inc.</w:t>
             </w:r>
           </w:p>
         </w:tc>
@@ -2280,7 +2302,7 @@
           </w:tcPr>
           <w:p>
             <w:r>
-              <w:t>Stock</w:t>
+              <w:t>Consumer Discretionary (Stock)</w:t>
             </w:r>
           </w:p>
         </w:tc>
@@ -2292,7 +2314,7 @@
           </w:tcPr>
           <w:p>
             <w:r>
-              <w:t>VGK</w:t>
+              <w:t>BA</w:t>
             </w:r>
           </w:p>
         </w:tc>
@@ -2302,7 +2324,7 @@
           </w:tcPr>
           <w:p>
             <w:r>
-              <w:t>Vanguard FTSE Europe ETF</w:t>
+              <w:t>Boeing Co.</w:t>
             </w:r>
           </w:p>
         </w:tc>
@@ -2312,7 +2334,7 @@
           </w:tcPr>
           <w:p>
             <w:r>
-              <w:t>ETF</w:t>
+              <w:t>Industrials (Stock)</w:t>
             </w:r>
           </w:p>
         </w:tc>
@@ -5725,6 +5747,14 @@
     <w:p>
       <w:pPr>
         <w:pStyle w:val="ListParagraph"/>
+      </w:pPr>
+      <w:r>
+        <w:t>Hold at most 2 open positions in any one sector (config.MAX_PER_SECTOR) — sector ETFs count in their sector; broad/bond/international ETFs share one “Broad/Index” bucket (see sectors.py).</w:t>
+      </w:r>
+    </w:p>
+    <w:p>
+      <w:pPr>
+        <w:pStyle w:val="ListParagraph"/>
         <w:numPr>
           <w:ilvl w:val="0"/>
           <w:numId w:val="2"/>
@@ -7967,14 +7997,9 @@
     <w:p>
       <w:pPr>
         <w:pStyle w:val="ListParagraph"/>
-        <w:numPr>
-          <w:ilvl w:val="0"/>
-          <w:numId w:val="2"/>
-        </w:numPr>
-        <w:spacing w:before="60" w:after="60"/>
-      </w:pPr>
-      <w:r>
-        <w:t>Always take the ATR-based hard stop — no hoping, no waiting</w:t>
+      </w:pPr>
+      <w:r>
+        <w:t>Never hold more than 2 positions in one sector — keep the book diversified</w:t>
       </w:r>
     </w:p>
     <w:p>
@@ -7987,7 +8012,7 @@
         <w:spacing w:before="60" w:after="60"/>
       </w:pPr>
       <w:r>
-        <w:t>Always use limit orders first — fall back to market only if unfilled by 09:45 ET</w:t>
+        <w:t>Always take the ATR-based hard stop — no hoping, no waiting</w:t>
       </w:r>
     </w:p>
     <w:p>
@@ -8000,49 +8025,8 @@
         <w:spacing w:before="60" w:after="60"/>
       </w:pPr>
       <w:r>
-        <w:t>Always log every trade with entry, exit, reason, and outcome</w:t>
-      </w:r>
-    </w:p>
-    <w:p>
-      <w:pPr>
-        <w:spacing w:before="80" w:after="80"/>
-      </w:pPr>
-    </w:p>
-    <w:p>
-      <w:pPr>
-        <w:pStyle w:val="Heading1"/>
-        <w:pBdr>
-          <w:bottom w:val="single" w:sz="6" w:space="4" w:color="2E75B6"/>
-        </w:pBdr>
-      </w:pPr>
-      <w:r>
-        <w:t xml:space="preserve">10. </w:t>
-      </w:r>
-      <w:proofErr w:type="spellStart"/>
-      <w:r>
-        <w:t>Backtest</w:t>
-      </w:r>
-      <w:proofErr w:type="spellEnd"/>
-      <w:r>
-        <w:t xml:space="preserve"> Notes</w:t>
-      </w:r>
-    </w:p>
-    <w:p>
-      <w:pPr>
-        <w:spacing w:before="80" w:after="80"/>
-      </w:pPr>
-      <w:r>
-        <w:t>The ATR-based hard stop is the primary parameter to validate through backtesting. Key questions to answer:</w:t>
-      </w:r>
-      <w:proofErr w:type="spellStart"/>
-      <w:r/>
-      <w:proofErr w:type="spellEnd"/>
-      <w:r/>
-    </w:p>
-    <w:p>
-      <w:pPr>
-        <w:spacing w:before="80" w:after="80"/>
-      </w:pPr>
+        <w:t>Always use limit orders first — fall back to market only if unfilled by 09:45 ET</w:t>
+      </w:r>
     </w:p>
     <w:p>
       <w:pPr>
@@ -8054,8 +8038,49 @@
         <w:spacing w:before="60" w:after="60"/>
       </w:pPr>
       <w:r>
-        <w:t>Does 1.5x ATR give enough room to avoid premature exits on normal ETF volatility?</w:t>
-      </w:r>
+        <w:t>Always log every trade with entry, exit, reason, and outcome</w:t>
+      </w:r>
+    </w:p>
+    <w:p>
+      <w:pPr>
+        <w:spacing w:before="80" w:after="80"/>
+      </w:pPr>
+    </w:p>
+    <w:p>
+      <w:pPr>
+        <w:pStyle w:val="Heading1"/>
+        <w:pBdr>
+          <w:bottom w:val="single" w:sz="6" w:space="4" w:color="2E75B6"/>
+        </w:pBdr>
+      </w:pPr>
+      <w:r>
+        <w:t xml:space="preserve">10. </w:t>
+      </w:r>
+      <w:proofErr w:type="spellStart"/>
+      <w:r>
+        <w:t>Backtest</w:t>
+      </w:r>
+      <w:proofErr w:type="spellEnd"/>
+      <w:r>
+        <w:t xml:space="preserve"> Notes</w:t>
+      </w:r>
+    </w:p>
+    <w:p>
+      <w:pPr>
+        <w:spacing w:before="80" w:after="80"/>
+      </w:pPr>
+      <w:r>
+        <w:t>The ATR-based hard stop is the primary parameter to validate through backtesting. Key questions to answer:</w:t>
+      </w:r>
+      <w:proofErr w:type="spellStart"/>
+      <w:r/>
+      <w:proofErr w:type="spellEnd"/>
+      <w:r/>
+    </w:p>
+    <w:p>
+      <w:pPr>
+        <w:spacing w:before="80" w:after="80"/>
+      </w:pPr>
     </w:p>
     <w:p>
       <w:pPr>
@@ -8067,7 +8092,7 @@
         <w:spacing w:before="60" w:after="60"/>
       </w:pPr>
       <w:r>
-        <w:t>What is the win rate with Stop A (1.5x ATR) vs Stop B (2.5x ATR)?</w:t>
+        <w:t>Does 1.5x ATR give enough room to avoid premature exits on normal ETF volatility?</w:t>
       </w:r>
     </w:p>
     <w:p>
@@ -8080,7 +8105,7 @@
         <w:spacing w:before="60" w:after="60"/>
       </w:pPr>
       <w:r>
-        <w:t>What is the maximum drawdown with each stop multiplier applied?</w:t>
+        <w:t>What is the win rate with Stop A (1.5x ATR) vs Stop B (2.5x ATR)?</w:t>
       </w:r>
     </w:p>
     <w:p>
@@ -8093,7 +8118,7 @@
         <w:spacing w:before="60" w:after="60"/>
       </w:pPr>
       <w:r>
-        <w:t>How many signals per month does this system generate across 16 ETFs?</w:t>
+        <w:t>What is the maximum drawdown with each stop multiplier applied?</w:t>
       </w:r>
     </w:p>
     <w:p>
@@ -8106,6 +8131,19 @@
         <w:spacing w:before="60" w:after="60"/>
       </w:pPr>
       <w:r>
+        <w:t>How many signals per month does this system generate across 16 ETFs?</w:t>
+      </w:r>
+    </w:p>
+    <w:p>
+      <w:pPr>
+        <w:pStyle w:val="ListParagraph"/>
+        <w:numPr>
+          <w:ilvl w:val="0"/>
+          <w:numId w:val="2"/>
+        </w:numPr>
+        <w:spacing w:before="60" w:after="60"/>
+      </w:pPr>
+      <w:r>
         <w:t>Volume spike filter — ANSWERED: it removed ~90% of signals and cut returns, so it is now DISABLED (v1.1).</w:t>
       </w:r>
     </w:p>
@@ -8155,6 +8193,36 @@
       </w:pPr>
       <w:r>
         <w:t>11. Revision History</w:t>
+      </w:r>
+    </w:p>
+    <w:p>
+      <w:pPr/>
+      <w:r>
+        <w:t>Version 1.3 — June 15, 2026. Changes made to bring the rulebook in line with the live code:</w:t>
+      </w:r>
+    </w:p>
+    <w:p>
+      <w:pPr>
+        <w:pStyle w:val="ListParagraph"/>
+      </w:pPr>
+      <w:r>
+        <w:t>Universe refreshed to the latest top-30 from screener.py — now a mix of individual stocks plus sector, bond, and international ETFs. Each symbol is tagged by sector in sectors.csv (drafted by the screener via yfinance, normalized to GICS names).</w:t>
+      </w:r>
+    </w:p>
+    <w:p>
+      <w:pPr>
+        <w:pStyle w:val="ListParagraph"/>
+      </w:pPr>
+      <w:r>
+        <w:t>Added a per-sector position cap (config.MAX_PER_SECTOR = 2): at most 2 open positions in any one sector, enforced alongside the 5-position portfolio cap. Sector ETFs count in their GICS sector; broad/bond/international ETFs share one “Broad/Index” bucket.</w:t>
+      </w:r>
+    </w:p>
+    <w:p>
+      <w:pPr>
+        <w:pStyle w:val="ListParagraph"/>
+      </w:pPr>
+      <w:r>
+        <w:t>Added backtest_portfolio.py — a shared-capital backtest that enforces both caps (the per-symbol backtest.py cannot see them). It revealed that ATR-risk sizing on very low-volatility names (e.g. bond ETFs) can build positions far larger than equity; a notional cap is the open follow-up.</w:t>
       </w:r>
     </w:p>
     <w:p>

</xml_diff>